<commit_message>
cv not updating properly with pubs...
</commit_message>
<xml_diff>
--- a/docs/cv.docx
+++ b/docs/cv.docx
@@ -5,20 +5,19 @@
     <w:p>
       <w:pPr>
         <w:pStyle w:val="Title"/>
-        <w:spacing w:after="0"/>
         <w:rPr>
           <w:rFonts w:ascii="Century Gothic" w:hAnsi="Century Gothic"/>
-          <w:sz w:val="40"/>
-          <w:szCs w:val="40"/>
-        </w:rPr>
-      </w:pPr>
-      <w:bookmarkStart w:id="0" w:name="_GoBack"/>
-      <w:bookmarkEnd w:id="0"/>
+          <w:spacing w:val="-20"/>
+          <w:sz w:val="48"/>
+          <w:szCs w:val="48"/>
+        </w:rPr>
+      </w:pPr>
       <w:r>
         <w:rPr>
           <w:rFonts w:ascii="Century Gothic" w:hAnsi="Century Gothic"/>
-          <w:sz w:val="40"/>
-          <w:szCs w:val="40"/>
+          <w:spacing w:val="-20"/>
+          <w:sz w:val="48"/>
+          <w:szCs w:val="48"/>
         </w:rPr>
         <w:t>Casey O’Hara</w:t>
       </w:r>
@@ -35,35 +34,53 @@
         <w:rPr>
           <w:rFonts w:ascii="Century Gothic" w:hAnsi="Century Gothic"/>
         </w:rPr>
-        <w:t>casey.c.ohara@gmail.com</w:t>
-      </w:r>
-    </w:p>
-    <w:p>
-      <w:pPr>
-        <w:pStyle w:val="Heading1"/>
-      </w:pPr>
-      <w:bookmarkStart w:id="1" w:name="_Toc191390231"/>
-      <w:bookmarkStart w:id="2" w:name="education"/>
+        <w:t>casey.c.ohara@gmail.com | ohara@nceas.ucsb.edu</w:t>
+      </w:r>
+    </w:p>
+    <w:p>
+      <w:pPr>
+        <w:pStyle w:val="Heading2"/>
+      </w:pPr>
+      <w:bookmarkStart w:id="0" w:name="education"/>
       <w:r>
         <w:t>Education</w:t>
       </w:r>
-      <w:bookmarkEnd w:id="1"/>
-    </w:p>
-    <w:p>
-      <w:pPr>
-        <w:pStyle w:val="FirstParagraph"/>
-      </w:pPr>
-      <w:r>
-        <w:rPr>
-          <w:b/>
-        </w:rPr>
-        <w:t xml:space="preserve">PhD Environmental Science and </w:t>
-      </w:r>
-      <w:r>
-        <w:rPr>
-          <w:b/>
-        </w:rPr>
-        <w:t>Management (2022)</w:t>
+    </w:p>
+    <w:p>
+      <w:r>
+        <w:rPr>
+          <w:b/>
+        </w:rPr>
+        <w:t>PhD Environmental Science and Management (2022)</w:t>
+      </w:r>
+      <w:r>
+        <w:rPr>
+          <w:b/>
+        </w:rPr>
+        <w:br/>
+      </w:r>
+      <w:r>
+        <w:t>Bren School of Environmental Science &amp; Management, University of California, Santa Barbara</w:t>
+      </w:r>
+      <w:r>
+        <w:br/>
+      </w:r>
+      <w:r>
+        <w:rPr>
+          <w:i/>
+        </w:rPr>
+        <w:t>Committee: Dr. Benjamin Halpern (chair), Dr. Halley Froehlich, Dr. Christopher Costello</w:t>
+      </w:r>
+    </w:p>
+    <w:p>
+      <w:pPr>
+        <w:pStyle w:val="BodyText"/>
+      </w:pPr>
+      <w:r>
+        <w:rPr>
+          <w:b/>
+        </w:rPr>
+        <w:t>Master of Environmental Science and Management (2014)</w:t>
       </w:r>
       <w:r>
         <w:br/>
@@ -75,8 +92,9 @@
       <w:r>
         <w:rPr>
           <w:i/>
-        </w:rPr>
-        <w:t>Committee: Dr. Benjamin Halpern (chair), Dr. Halley Froehlich, Dr. Christopher Costello</w:t>
+          <w:iCs/>
+        </w:rPr>
+        <w:t>UCSB University Award of Distinction; Bren School Academic Achievement Award</w:t>
       </w:r>
     </w:p>
     <w:p>
@@ -87,26 +105,138 @@
         <w:rPr>
           <w:b/>
         </w:rPr>
-        <w:t>Master of Environmental Science and Management (2014)</w:t>
+        <w:t>Single Subject Teaching Credential</w:t>
+      </w:r>
+      <w:r>
+        <w:rPr>
+          <w:b/>
+        </w:rPr>
+        <w:t xml:space="preserve"> in Science, Physics (2004)</w:t>
       </w:r>
       <w:r>
         <w:br/>
-      </w:r>
-      <w:r>
-        <w:t>Bren</w:t>
-      </w:r>
-      <w:r>
-        <w:t xml:space="preserve"> School of Environmental Science &amp; Management, University of California, Santa Barbara</w:t>
+        <w:t>Graduate School of Education, San Francisco State University</w:t>
+      </w:r>
+    </w:p>
+    <w:p>
+      <w:pPr>
+        <w:pStyle w:val="BodyText"/>
+      </w:pPr>
+      <w:r>
+        <w:rPr>
+          <w:b/>
+        </w:rPr>
+        <w:t>Master of Science in Mechanical Engineering Design (1994)</w:t>
       </w:r>
       <w:r>
         <w:br/>
+        <w:t>Department of Mechanical Engineering, Design Division, Stanford University</w:t>
+      </w:r>
+    </w:p>
+    <w:p>
+      <w:pPr>
+        <w:pStyle w:val="BodyText"/>
+      </w:pPr>
+      <w:r>
+        <w:rPr>
+          <w:b/>
+        </w:rPr>
+        <w:t xml:space="preserve">Bachelor of Science in Mechanical </w:t>
+      </w:r>
+      <w:r>
+        <w:rPr>
+          <w:b/>
+        </w:rPr>
+        <w:t>Engineering (1993)</w:t>
+      </w:r>
+      <w:r>
+        <w:br/>
+        <w:t>Department of Mechanical Engineering, Stanford University</w:t>
+      </w:r>
+    </w:p>
+    <w:p>
+      <w:pPr>
+        <w:pStyle w:val="Heading2"/>
+      </w:pPr>
+      <w:bookmarkStart w:id="1" w:name="environmental-science-and-management"/>
+      <w:bookmarkEnd w:id="0"/>
+      <w:r>
+        <w:t>Environmental science and management</w:t>
+      </w:r>
+    </w:p>
+    <w:p>
+      <w:pPr>
+        <w:pStyle w:val="FirstParagraph"/>
+      </w:pPr>
+      <w:r>
+        <w:rPr>
+          <w:b/>
+        </w:rPr>
+        <w:t>Project Scientist</w:t>
+      </w:r>
+      <w:r>
+        <w:t xml:space="preserve"> (March 2025 - present)  National Center for Ecological Analysis and Synthesis - Santa Barbara, CA</w:t>
+      </w:r>
+    </w:p>
+    <w:p>
+      <w:pPr>
+        <w:pStyle w:val="BodyText"/>
+      </w:pPr>
+      <w:r>
+        <w:rPr>
+          <w:b/>
+        </w:rPr>
+        <w:t>Postdoctoral Researcher, C</w:t>
+      </w:r>
+      <w:r>
+        <w:rPr>
+          <w:b/>
+        </w:rPr>
+        <w:t>ollaborative Network for Valuing Earth Information</w:t>
+      </w:r>
+      <w:r>
+        <w:t xml:space="preserve"> (March 2023 – February 2025)  National Center for Ecological Analysis and Synthesis - Santa Barbara, CA</w:t>
+      </w:r>
+    </w:p>
+    <w:p>
+      <w:pPr>
+        <w:pStyle w:val="BodyText"/>
+      </w:pPr>
+      <w:r>
+        <w:rPr>
+          <w:b/>
+        </w:rPr>
+        <w:t>Researcher, Ocean Health Index</w:t>
+      </w:r>
+      <w:r>
+        <w:t xml:space="preserve"> (January 2015 – March 2023)  National Center for Ecological Analysis a</w:t>
+      </w:r>
+      <w:r>
+        <w:t>nd Synthesis - Santa Barbara, CA</w:t>
+      </w:r>
+    </w:p>
+    <w:p>
+      <w:pPr>
+        <w:pStyle w:val="BodyText"/>
+      </w:pPr>
+      <w:r>
+        <w:rPr>
+          <w:b/>
+        </w:rPr>
+        <w:t>AAAS Mass Media Science Fellowship</w:t>
+      </w:r>
+      <w:r>
+        <w:t xml:space="preserve"> (June 2014 - September 2014)  </w:t>
       </w:r>
       <w:r>
         <w:rPr>
           <w:i/>
           <w:iCs/>
         </w:rPr>
-        <w:t>UCSB University Award of Distinction; Bren School Academic Achievement Award</w:t>
+        <w:t>The Oregonian</w:t>
+      </w:r>
+      <w:r>
+        <w:t xml:space="preserve"> - Portland, OR</w:t>
       </w:r>
     </w:p>
     <w:p>
@@ -117,11 +247,13 @@
         <w:rPr>
           <w:b/>
         </w:rPr>
-        <w:t>Single Subject Teaching Credential in Science, Physics (2004)</w:t>
-      </w:r>
-      <w:r>
-        <w:br/>
-        <w:t>Graduate School of Education, San Francisco State University</w:t>
+        <w:t>Program Consultant</w:t>
+      </w:r>
+      <w:r>
+        <w:t xml:space="preserve"> (June 2013 - August 2013)  The School for Examining Essential Questions of Sustainability (SEEQS) Charter Scho</w:t>
+      </w:r>
+      <w:r>
+        <w:t>ol - Honolulu, HI</w:t>
       </w:r>
     </w:p>
     <w:p>
@@ -132,170 +264,24 @@
         <w:rPr>
           <w:b/>
         </w:rPr>
-        <w:t>Master of Science in Mechanical Engineering Design (1994)</w:t>
-      </w:r>
-      <w:r>
-        <w:br/>
-        <w:t>Department of Mechanical Engineering, Design Division, Stanford University</w:t>
-      </w:r>
-    </w:p>
-    <w:p>
-      <w:pPr>
-        <w:pStyle w:val="BodyText"/>
-      </w:pPr>
-      <w:r>
-        <w:rPr>
-          <w:b/>
-        </w:rPr>
-        <w:t>Bachelor of Science in Mechanical Engineering (1993)</w:t>
-      </w:r>
-      <w:r>
-        <w:br/>
-        <w:t>Department of Mechanical Engineering, Stanford University</w:t>
-      </w:r>
-    </w:p>
-    <w:p>
-      <w:pPr>
-        <w:pStyle w:val="Heading1"/>
-      </w:pPr>
-      <w:bookmarkStart w:id="3" w:name="_Toc191390232"/>
-      <w:bookmarkStart w:id="4" w:name="environmental-science-and-management"/>
-      <w:bookmarkEnd w:id="2"/>
-      <w:r>
-        <w:t>Environmental science and management</w:t>
-      </w:r>
-      <w:bookmarkEnd w:id="3"/>
-    </w:p>
-    <w:p>
-      <w:pPr>
-        <w:pStyle w:val="FirstParagraph"/>
-        <w:numPr>
-          <w:ilvl w:val="0"/>
-          <w:numId w:val="14"/>
-        </w:numPr>
-      </w:pPr>
-      <w:r>
-        <w:t>Postdoctoral Researcher, Collaborative Network for Valuing Earth Information (March 2023 – February 2025</w:t>
-      </w:r>
-      <w:proofErr w:type="gramStart"/>
-      <w:r>
-        <w:t>)  National</w:t>
-      </w:r>
-      <w:proofErr w:type="gramEnd"/>
-      <w:r>
-        <w:t xml:space="preserve"> Center for Ecological Analysis and Synthesis - Santa Barbara, CA</w:t>
-      </w:r>
-    </w:p>
-    <w:p>
-      <w:pPr>
-        <w:pStyle w:val="BodyText"/>
-        <w:numPr>
-          <w:ilvl w:val="0"/>
-          <w:numId w:val="14"/>
-        </w:numPr>
-      </w:pPr>
-      <w:r>
-        <w:t>Researcher, Ocean Health Index (January 2015 – March 2023</w:t>
-      </w:r>
-      <w:proofErr w:type="gramStart"/>
-      <w:r>
-        <w:t>)  National</w:t>
-      </w:r>
-      <w:proofErr w:type="gramEnd"/>
-      <w:r>
-        <w:t xml:space="preserve"> Center for Ecological Analysis and Synthesis - Santa Barbara, CA</w:t>
-      </w:r>
-    </w:p>
-    <w:p>
-      <w:pPr>
-        <w:pStyle w:val="BodyText"/>
-        <w:numPr>
-          <w:ilvl w:val="0"/>
-          <w:numId w:val="14"/>
-        </w:numPr>
-      </w:pPr>
-      <w:r>
-        <w:t>AAAS Mass Media Science Fellowship (June 2014 - September 2014</w:t>
-      </w:r>
-      <w:proofErr w:type="gramStart"/>
-      <w:r>
-        <w:t xml:space="preserve">)  </w:t>
-      </w:r>
-      <w:r>
-        <w:rPr>
-          <w:i/>
-          <w:iCs/>
-        </w:rPr>
-        <w:t>The</w:t>
-      </w:r>
-      <w:proofErr w:type="gramEnd"/>
-      <w:r>
-        <w:rPr>
-          <w:i/>
-          <w:iCs/>
-        </w:rPr>
-        <w:t xml:space="preserve"> Oregonian</w:t>
-      </w:r>
-      <w:r>
-        <w:t xml:space="preserve"> - Portland, OR</w:t>
-      </w:r>
-    </w:p>
-    <w:p>
-      <w:pPr>
-        <w:pStyle w:val="BodyText"/>
-        <w:numPr>
-          <w:ilvl w:val="0"/>
-          <w:numId w:val="14"/>
-        </w:numPr>
-      </w:pPr>
-      <w:r>
-        <w:t>Program Consultant (June 2013 - August 2013</w:t>
-      </w:r>
-      <w:proofErr w:type="gramStart"/>
-      <w:r>
-        <w:t>)  The</w:t>
-      </w:r>
-      <w:proofErr w:type="gramEnd"/>
-      <w:r>
-        <w:t xml:space="preserve"> School for Examining Essential Questions of Sustainability (SEEQS) Charter School - Honolulu, HI</w:t>
-      </w:r>
-    </w:p>
-    <w:p>
-      <w:pPr>
-        <w:pStyle w:val="BodyText"/>
-        <w:numPr>
-          <w:ilvl w:val="0"/>
-          <w:numId w:val="14"/>
-        </w:numPr>
-      </w:pPr>
-      <w:proofErr w:type="spellStart"/>
-      <w:r>
-        <w:t>Masters</w:t>
-      </w:r>
-      <w:proofErr w:type="spellEnd"/>
-      <w:r>
-        <w:t xml:space="preserve"> Thesis Group Project (April 2013 - June 2014</w:t>
-      </w:r>
-      <w:proofErr w:type="gramStart"/>
-      <w:r>
-        <w:t>)  UCSB</w:t>
-      </w:r>
-      <w:proofErr w:type="gramEnd"/>
-      <w:r>
-        <w:t xml:space="preserve"> Bren School - Santa Barbara, CA “Offshore wind energy in the context of multiple ocean uses on the Bermuda platform.” Client: Department of Environmental Protection, Bermuda</w:t>
-      </w:r>
-    </w:p>
-    <w:p>
-      <w:pPr>
-        <w:pStyle w:val="Heading1"/>
-      </w:pPr>
-      <w:bookmarkStart w:id="5" w:name="_Toc191390233"/>
-      <w:bookmarkStart w:id="6" w:name="teaching-and-mentoring-post-secondary"/>
-      <w:bookmarkEnd w:id="4"/>
-      <w:r>
-        <w:t>Teaching and mentoring (post-secondary)</w:t>
-      </w:r>
-      <w:bookmarkEnd w:id="5"/>
+        <w:t>Masters Thesis Group Project</w:t>
+      </w:r>
+      <w:r>
+        <w:t xml:space="preserve"> (April 2013 - June 2014)  UCSB Bren School - Santa Barbara, CA “Offshore wind energy in the context of multiple ocean uses on the Bermuda platform.” Client: Department of Environmental Protection, Bermuda</w:t>
+      </w:r>
+    </w:p>
+    <w:p>
+      <w:pPr>
+        <w:pStyle w:val="Heading2"/>
+      </w:pPr>
+      <w:bookmarkStart w:id="2" w:name="teaching-and-mentoring-post-secondary"/>
+      <w:bookmarkEnd w:id="1"/>
+      <w:r>
+        <w:t>Teac</w:t>
+      </w:r>
+      <w:r>
+        <w:t>hing and mentoring (post-secondary)</w:t>
+      </w:r>
     </w:p>
     <w:p>
       <w:pPr>
@@ -304,8 +290,14 @@
           <w:ilvl w:val="0"/>
           <w:numId w:val="2"/>
         </w:numPr>
-      </w:pPr>
-      <w:r>
+        <w:rPr>
+          <w:b/>
+        </w:rPr>
+      </w:pPr>
+      <w:r>
+        <w:rPr>
+          <w:b/>
+        </w:rPr>
         <w:t>Lecturer</w:t>
       </w:r>
     </w:p>
@@ -340,8 +332,14 @@
           <w:ilvl w:val="0"/>
           <w:numId w:val="2"/>
         </w:numPr>
-      </w:pPr>
-      <w:r>
+        <w:rPr>
+          <w:b/>
+        </w:rPr>
+      </w:pPr>
+      <w:r>
+        <w:rPr>
+          <w:b/>
+        </w:rPr>
         <w:t>Teaching Associate</w:t>
       </w:r>
     </w:p>
@@ -366,7 +364,19 @@
         </w:numPr>
       </w:pPr>
       <w:r>
-        <w:t>Teaching Assistant (Recipient of 2021 Bren Teaching Assistant Award)</w:t>
+        <w:rPr>
+          <w:b/>
+        </w:rPr>
+        <w:t>Tea</w:t>
+      </w:r>
+      <w:r>
+        <w:rPr>
+          <w:b/>
+        </w:rPr>
+        <w:t>ching Assistant</w:t>
+      </w:r>
+      <w:r>
+        <w:t xml:space="preserve"> (Recipient of 2021 Bren Teaching Assistant Award)</w:t>
       </w:r>
     </w:p>
     <w:p>
@@ -378,6 +388,7 @@
         </w:numPr>
       </w:pPr>
       <w:r>
+        <w:lastRenderedPageBreak/>
         <w:t>Statistics &amp; Data Analysis for Environmental Science &amp; Management (ESM206) (Fall 2019, 2021)</w:t>
       </w:r>
     </w:p>
@@ -402,7 +413,10 @@
         </w:numPr>
       </w:pPr>
       <w:r>
-        <w:t>Geographic Information Systems (ESM263) (Winter 2020)</w:t>
+        <w:t>Geographic Information Systems (ESM263) (Winter 202</w:t>
+      </w:r>
+      <w:r>
+        <w:t>0)</w:t>
       </w:r>
     </w:p>
     <w:p>
@@ -436,8 +450,14 @@
           <w:ilvl w:val="0"/>
           <w:numId w:val="2"/>
         </w:numPr>
-      </w:pPr>
-      <w:r>
+        <w:rPr>
+          <w:b/>
+        </w:rPr>
+      </w:pPr>
+      <w:r>
+        <w:rPr>
+          <w:b/>
+        </w:rPr>
         <w:t>Group Project Mentor/External Advisor</w:t>
       </w:r>
     </w:p>
@@ -462,7 +482,6 @@
         </w:numPr>
       </w:pPr>
       <w:r>
-        <w:lastRenderedPageBreak/>
         <w:t>Developing a site suitability framework for shellfish aquaculture on Canada’s Pacific Coast (2021-2022)</w:t>
       </w:r>
     </w:p>
@@ -475,7 +494,10 @@
         </w:numPr>
       </w:pPr>
       <w:r>
-        <w:t>Spatial Analysis to Inform Policy Recommendations for Shark and Ray Protection in Mozambique (2020-2021)</w:t>
+        <w:t>Spatial Analysis to Inform Policy Recommendation</w:t>
+      </w:r>
+      <w:r>
+        <w:t>s for Shark and Ray Protection in Mozambique (2020-2021)</w:t>
       </w:r>
     </w:p>
     <w:p>
@@ -495,20 +517,21 @@
         <w:pStyle w:val="FirstParagraph"/>
       </w:pPr>
       <w:r>
-        <w:t>See also STEM Education and Engineering</w:t>
-      </w:r>
-    </w:p>
-    <w:p>
-      <w:pPr>
-        <w:pStyle w:val="Heading1"/>
-      </w:pPr>
-      <w:bookmarkStart w:id="7" w:name="_Toc191390234"/>
-      <w:bookmarkStart w:id="8" w:name="relevant-technical-skills"/>
-      <w:bookmarkEnd w:id="6"/>
+        <w:t xml:space="preserve">See also </w:t>
+      </w:r>
+      <w:r>
+        <w:t>STEM Education and Engineering</w:t>
+      </w:r>
+    </w:p>
+    <w:p>
+      <w:pPr>
+        <w:pStyle w:val="Heading2"/>
+      </w:pPr>
+      <w:bookmarkStart w:id="3" w:name="relevant-technical-skills"/>
+      <w:bookmarkEnd w:id="2"/>
       <w:r>
         <w:t>Relevant technical skills</w:t>
       </w:r>
-      <w:bookmarkEnd w:id="7"/>
     </w:p>
     <w:p>
       <w:pPr>
@@ -519,7 +542,10 @@
         </w:numPr>
       </w:pPr>
       <w:r>
-        <w:t>Proficient: R/R Studio including spatial analysis, data visualization, package development, ShinyApps</w:t>
+        <w:t>R/R Studio including spatial analysis, data visualiz</w:t>
+      </w:r>
+      <w:r>
+        <w:t>ation, package development, ShinyApps</w:t>
       </w:r>
     </w:p>
     <w:p>
@@ -531,15 +557,7 @@
         </w:numPr>
       </w:pPr>
       <w:r>
-        <w:t xml:space="preserve">Proficient: </w:t>
-      </w:r>
-      <w:proofErr w:type="spellStart"/>
-      <w:r>
-        <w:t>Git</w:t>
-      </w:r>
-      <w:proofErr w:type="spellEnd"/>
-      <w:r>
-        <w:t>/GitHub version control and project management</w:t>
+        <w:t>Git/GitHub version control and project management</w:t>
       </w:r>
     </w:p>
     <w:p>
@@ -551,7 +569,7 @@
         </w:numPr>
       </w:pPr>
       <w:r>
-        <w:t>Familiar: MATLAB, C/C++, HTML, JavaScript, LaTeX</w:t>
+        <w:t>MATLAB, C/C++, HTML, JavaScript, LaTeX</w:t>
       </w:r>
     </w:p>
     <w:p>
@@ -563,20 +581,18 @@
         </w:numPr>
       </w:pPr>
       <w:r>
-        <w:t>Familiar: ArcGIS, QGIS</w:t>
-      </w:r>
-    </w:p>
-    <w:p>
-      <w:pPr>
-        <w:pStyle w:val="Heading1"/>
-      </w:pPr>
-      <w:bookmarkStart w:id="9" w:name="_Toc191390235"/>
-      <w:bookmarkStart w:id="10" w:name="working-groups"/>
-      <w:bookmarkEnd w:id="8"/>
+        <w:t>ArcGIS, QGIS</w:t>
+      </w:r>
+    </w:p>
+    <w:p>
+      <w:pPr>
+        <w:pStyle w:val="Heading2"/>
+      </w:pPr>
+      <w:bookmarkStart w:id="4" w:name="working-groups"/>
+      <w:bookmarkEnd w:id="3"/>
       <w:r>
         <w:t>Working groups</w:t>
       </w:r>
-      <w:bookmarkEnd w:id="9"/>
     </w:p>
     <w:p>
       <w:pPr>
@@ -587,11 +603,35 @@
         </w:numPr>
       </w:pPr>
       <w:r>
-        <w:t xml:space="preserve">Collaborative Network for Valuing Earth Information (March 2023, </w:t>
+        <w:rPr>
+          <w:b/>
+        </w:rPr>
+        <w:t>USGS Climate Adaptation Postdoctoral Fellows Program</w:t>
+      </w:r>
+      <w:r>
+        <w:t xml:space="preserve"> (September 2025, ongoing) </w:t>
+      </w:r>
+    </w:p>
+    <w:p>
+      <w:pPr>
+        <w:pStyle w:val="Compact"/>
+        <w:numPr>
+          <w:ilvl w:val="0"/>
+          <w:numId w:val="8"/>
+        </w:numPr>
+      </w:pPr>
+      <w:r>
+        <w:rPr>
+          <w:b/>
+        </w:rPr>
+        <w:t>Collaborative Network for Valuing Earth Information</w:t>
+      </w:r>
+      <w:r>
+        <w:t xml:space="preserve"> (March 2023</w:t>
       </w:r>
       <w:proofErr w:type="gramStart"/>
       <w:r>
-        <w:t>ongoing)  WWF</w:t>
+        <w:t>)  WWF</w:t>
       </w:r>
       <w:proofErr w:type="gramEnd"/>
       <w:r>
@@ -607,88 +647,124 @@
         </w:numPr>
       </w:pPr>
       <w:r>
-        <w:t xml:space="preserve">Functional Interactions and Biodiversity Targets (April 2021, </w:t>
+        <w:rPr>
+          <w:b/>
+        </w:rPr>
+        <w:t>Functional Interactions and Biodiversity Targets</w:t>
+      </w:r>
+      <w:r>
+        <w:t xml:space="preserve"> (April 2021</w:t>
       </w:r>
       <w:proofErr w:type="gramStart"/>
       <w:r>
-        <w:t>ongoing)  National</w:t>
+        <w:t>)  National</w:t>
       </w:r>
       <w:proofErr w:type="gramEnd"/>
       <w:r>
+        <w:t xml:space="preserve"> Center for Ecological Analysis and Synt</w:t>
+      </w:r>
+      <w:r>
+        <w:t>hesis - Santa Barbara, CA</w:t>
+      </w:r>
+    </w:p>
+    <w:p>
+      <w:pPr>
+        <w:pStyle w:val="Compact"/>
+        <w:numPr>
+          <w:ilvl w:val="0"/>
+          <w:numId w:val="8"/>
+        </w:numPr>
+      </w:pPr>
+      <w:bookmarkStart w:id="5" w:name="_GoBack"/>
+      <w:r>
+        <w:rPr>
+          <w:b/>
+        </w:rPr>
+        <w:t>Species Vulnerability Working Group</w:t>
+      </w:r>
+      <w:r>
+        <w:t xml:space="preserve"> </w:t>
+      </w:r>
+      <w:bookmarkEnd w:id="5"/>
+      <w:r>
+        <w:t>(National Philanthropic Trust)</w:t>
+      </w:r>
+      <w:r>
+        <w:t xml:space="preserve"> (February 2020</w:t>
+      </w:r>
+      <w:proofErr w:type="gramStart"/>
+      <w:r>
+        <w:t>)  Matadradra</w:t>
+      </w:r>
+      <w:proofErr w:type="gramEnd"/>
+      <w:r>
+        <w:t xml:space="preserve"> Serua, Fiji</w:t>
+      </w:r>
+    </w:p>
+    <w:p>
+      <w:pPr>
+        <w:pStyle w:val="Compact"/>
+        <w:numPr>
+          <w:ilvl w:val="0"/>
+          <w:numId w:val="8"/>
+        </w:numPr>
+      </w:pPr>
+      <w:r>
+        <w:rPr>
+          <w:b/>
+        </w:rPr>
+        <w:t>Coastal Outcomes Working Group (SNAPP)</w:t>
+      </w:r>
+      <w:r>
+        <w:t xml:space="preserve"> (April 2019</w:t>
+      </w:r>
+      <w:proofErr w:type="gramStart"/>
+      <w:r>
+        <w:t>)  National</w:t>
+      </w:r>
+      <w:proofErr w:type="gramEnd"/>
+      <w:r>
+        <w:t xml:space="preserve"> Center for Ecological Analysis and Synthesis - Santa Barbara,</w:t>
+      </w:r>
+      <w:r>
+        <w:t xml:space="preserve"> CA</w:t>
+      </w:r>
+    </w:p>
+    <w:p>
+      <w:pPr>
+        <w:pStyle w:val="Compact"/>
+        <w:numPr>
+          <w:ilvl w:val="0"/>
+          <w:numId w:val="8"/>
+        </w:numPr>
+      </w:pPr>
+      <w:r>
+        <w:rPr>
+          <w:b/>
+        </w:rPr>
+        <w:t>Ocean Futures Working Group (SNAPP)</w:t>
+      </w:r>
+      <w:r>
+        <w:t xml:space="preserve"> (July 2018</w:t>
+      </w:r>
+      <w:proofErr w:type="gramStart"/>
+      <w:r>
+        <w:t>)  National</w:t>
+      </w:r>
+      <w:proofErr w:type="gramEnd"/>
+      <w:r>
         <w:t xml:space="preserve"> Center for Ecological Analysis and Synthesis - Santa Barbara, CA</w:t>
       </w:r>
     </w:p>
     <w:p>
       <w:pPr>
-        <w:pStyle w:val="Compact"/>
-        <w:numPr>
-          <w:ilvl w:val="0"/>
-          <w:numId w:val="8"/>
-        </w:numPr>
-      </w:pPr>
-      <w:r>
-        <w:t>Species Vulnerability Working Group (National Philanthropic Trust) (February 2020</w:t>
-      </w:r>
-      <w:proofErr w:type="gramStart"/>
-      <w:r>
-        <w:t>)  Matadradra</w:t>
-      </w:r>
-      <w:proofErr w:type="gramEnd"/>
-      <w:r>
-        <w:t xml:space="preserve"> Serua, Fiji</w:t>
-      </w:r>
-    </w:p>
-    <w:p>
-      <w:pPr>
-        <w:pStyle w:val="Compact"/>
-        <w:numPr>
-          <w:ilvl w:val="0"/>
-          <w:numId w:val="8"/>
-        </w:numPr>
-      </w:pPr>
-      <w:r>
-        <w:t>Coastal Outcomes Working Group (SNAPP) (April 2019</w:t>
-      </w:r>
-      <w:proofErr w:type="gramStart"/>
-      <w:r>
-        <w:t>)  National</w:t>
-      </w:r>
-      <w:proofErr w:type="gramEnd"/>
-      <w:r>
-        <w:t xml:space="preserve"> Center for Ecological Analysis and Synthesis - Santa Barbara, CA</w:t>
-      </w:r>
-    </w:p>
-    <w:p>
-      <w:pPr>
-        <w:pStyle w:val="Compact"/>
-        <w:numPr>
-          <w:ilvl w:val="0"/>
-          <w:numId w:val="8"/>
-        </w:numPr>
-      </w:pPr>
-      <w:r>
-        <w:t>Ocean Futures Working Group (SNAPP) (July 2018</w:t>
-      </w:r>
-      <w:proofErr w:type="gramStart"/>
-      <w:r>
-        <w:t>)  National</w:t>
-      </w:r>
-      <w:proofErr w:type="gramEnd"/>
-      <w:r>
-        <w:t xml:space="preserve"> Center for Ecological Analysis and Synthesis - Santa Barbara, CA</w:t>
-      </w:r>
-    </w:p>
-    <w:p>
-      <w:pPr>
-        <w:pStyle w:val="Heading1"/>
-      </w:pPr>
-      <w:bookmarkStart w:id="11" w:name="_Toc191390236"/>
-      <w:bookmarkStart w:id="12" w:name="selected-publications"/>
-      <w:bookmarkEnd w:id="10"/>
+        <w:pStyle w:val="Heading2"/>
+      </w:pPr>
+      <w:bookmarkStart w:id="6" w:name="selected-publications"/>
+      <w:bookmarkEnd w:id="4"/>
       <w:r>
         <w:t>Selected publications</w:t>
       </w:r>
-      <w:bookmarkEnd w:id="11"/>
     </w:p>
     <w:p>
       <w:pPr>
@@ -702,7 +778,13 @@
           <w:rPr>
             <w:rStyle w:val="Hyperlink"/>
           </w:rPr>
-          <w:t>Google Scholar profile</w:t>
+          <w:t>Google Scholar profi</w:t>
+        </w:r>
+        <w:r>
+          <w:rPr>
+            <w:rStyle w:val="Hyperlink"/>
+          </w:rPr>
+          <w:t>le</w:t>
         </w:r>
       </w:hyperlink>
       <w:r>
@@ -718,15 +800,89 @@
         </w:numPr>
       </w:pPr>
       <w:r>
+        <w:t xml:space="preserve">Halpern, B. S., Frazier, M., </w:t>
+      </w:r>
+      <w:r>
         <w:rPr>
           <w:b/>
         </w:rPr>
         <w:t>O’Hara, C. C.</w:t>
       </w:r>
       <w:r>
-        <w:t xml:space="preserve">, Frazier, M., Valle, M., Butt, N., Kaschner, K., Klein, C., &amp; Halpern, B. S. (2024). </w:t>
+        <w:t xml:space="preserve">, Vargas-Fonseca, O. A., &amp; Lombard, A. T. (2025). </w:t>
       </w:r>
       <w:hyperlink r:id="rId6">
+        <w:r>
+          <w:rPr>
+            <w:rStyle w:val="Hyperlink"/>
+          </w:rPr>
+          <w:t>Cumulative impacts to global marine ecosystems project</w:t>
+        </w:r>
+        <w:r>
+          <w:rPr>
+            <w:rStyle w:val="Hyperlink"/>
+          </w:rPr>
+          <w:t>ed to more than double by midcentury. Science, 0(0), eadv2906.</w:t>
+        </w:r>
+      </w:hyperlink>
+    </w:p>
+    <w:p>
+      <w:pPr>
+        <w:pStyle w:val="Compact"/>
+        <w:numPr>
+          <w:ilvl w:val="0"/>
+          <w:numId w:val="9"/>
+        </w:numPr>
+      </w:pPr>
+      <w:r>
+        <w:t xml:space="preserve">Mattalia, G., McAlvay, A., Teixidor-Toneu, I., Lukawiecki, J., Moola, F., Asfaw, Z., Cámara-Leret, R., Díaz, S., Franco, F. M., Halpern, B. S., </w:t>
+      </w:r>
+      <w:r>
+        <w:rPr>
+          <w:b/>
+        </w:rPr>
+        <w:t>O’Hara, C.</w:t>
+      </w:r>
+      <w:r>
+        <w:t>, Renard, D., Uprety, Y., Wall, J., Zaf</w:t>
+      </w:r>
+      <w:r>
+        <w:t xml:space="preserve">ra-Calvo, </w:t>
+      </w:r>
+      <w:r>
+        <w:lastRenderedPageBreak/>
+        <w:t xml:space="preserve">N., &amp; Reyes-García, V. (2025). </w:t>
+      </w:r>
+      <w:hyperlink r:id="rId7">
+        <w:r>
+          <w:rPr>
+            <w:rStyle w:val="Hyperlink"/>
+          </w:rPr>
+          <w:t>Cultural keystone species as a tool for biocultural stewardship. A global review. People and Nature, 7(5), 947–959.</w:t>
+        </w:r>
+      </w:hyperlink>
+    </w:p>
+    <w:p>
+      <w:pPr>
+        <w:pStyle w:val="Compact"/>
+        <w:numPr>
+          <w:ilvl w:val="0"/>
+          <w:numId w:val="9"/>
+        </w:numPr>
+      </w:pPr>
+      <w:r>
+        <w:rPr>
+          <w:b/>
+        </w:rPr>
+        <w:t>O’Hara, C. C.</w:t>
+      </w:r>
+      <w:r>
+        <w:t xml:space="preserve">, Frazier, M., Valle, M., Butt, </w:t>
+      </w:r>
+      <w:r>
+        <w:t xml:space="preserve">N., Kaschner, K., Klein, C., &amp; Halpern, B. S. (2024). </w:t>
+      </w:r>
+      <w:hyperlink r:id="rId8">
         <w:r>
           <w:rPr>
             <w:rStyle w:val="Hyperlink"/>
@@ -744,7 +900,10 @@
         </w:numPr>
       </w:pPr>
       <w:r>
-        <w:t xml:space="preserve">Mattalia, G., McAlvay, A., Teixidor-Toneu, I., Lukawiecki, J., Moola, F., Asfaw, Z., Cámara-Leret, R., Díaz, S., Franco, F. M., Halpern, B. S., </w:t>
+        <w:t>Mattalia</w:t>
+      </w:r>
+      <w:r>
+        <w:t xml:space="preserve">, G., McAlvay, A., Teixidor-Toneu, I., Lukawiecki, J., Moola, F., Asfaw, Z., Cámara-Leret, R., Díaz, S., Franco, F. M., Halpern, B. S., </w:t>
       </w:r>
       <w:r>
         <w:rPr>
@@ -755,7 +914,7 @@
       <w:r>
         <w:t xml:space="preserve">, Renard, D., Uprety, Y., Wall, J., Zafra-Calvo, N., &amp; Reyes-García, V. (2024). </w:t>
       </w:r>
-      <w:hyperlink r:id="rId7">
+      <w:hyperlink r:id="rId9">
         <w:r>
           <w:rPr>
             <w:rStyle w:val="Hyperlink"/>
@@ -773,16 +932,20 @@
         </w:numPr>
       </w:pPr>
       <w:r>
-        <w:t xml:space="preserve">Froehlich, H. E., Montgomery, J. C., Williams, D. R., O’Hara, C., Kuempel, C. D., &amp; Halpern, B. S. (2023). Biological life-history and farming scenarios of marine aquaculture to help reduce wild marine fishing pressure. Fish and Fisheries. </w:t>
-      </w:r>
-      <w:hyperlink r:id="rId8">
-        <w:r>
-          <w:rPr>
-            <w:rStyle w:val="Hyperlink"/>
-          </w:rPr>
-          <w:t>https://doi.org/10.1111/faf.12783</w:t>
-        </w:r>
-      </w:hyperlink>
+        <w:t xml:space="preserve">Froehlich, H. E., Montgomery, J. C., Williams, D. R., </w:t>
+      </w:r>
+      <w:r>
+        <w:rPr>
+          <w:b/>
+        </w:rPr>
+        <w:t>O’Hara, C.</w:t>
+      </w:r>
+      <w:r>
+        <w:t>, Kuempel, C. D., &amp; Halpern, B. S. (2023). Biological lif</w:t>
+      </w:r>
+      <w:r>
+        <w:t>e-history and farming scenarios of marine aquaculture to help reduce wild marine fishing pressure. Fish and Fisheries. https://doi.org/10.1111/faf.12783</w:t>
+      </w:r>
     </w:p>
     <w:p>
       <w:pPr>
@@ -801,7 +964,7 @@
       <w:r>
         <w:t xml:space="preserve">, Frazier, M., Valle, M., Butt, N., Kaschner, K., Klein, C., &amp; Halpern, B. S. (2024). </w:t>
       </w:r>
-      <w:hyperlink r:id="rId9">
+      <w:hyperlink r:id="rId10">
         <w:r>
           <w:rPr>
             <w:rStyle w:val="Hyperlink"/>
@@ -830,20 +993,12 @@
       <w:r>
         <w:t xml:space="preserve">, Renard, D., Zafra-Calvo, N., Díaz, S. (2023). </w:t>
       </w:r>
-      <w:hyperlink r:id="rId10">
-        <w:proofErr w:type="spellStart"/>
+      <w:hyperlink r:id="rId11">
         <w:r>
           <w:rPr>
             <w:rStyle w:val="Hyperlink"/>
           </w:rPr>
-          <w:t>Biocultural</w:t>
-        </w:r>
-        <w:proofErr w:type="spellEnd"/>
-        <w:r>
-          <w:rPr>
-            <w:rStyle w:val="Hyperlink"/>
-          </w:rPr>
-          <w:t xml:space="preserve"> vulnerability exposes threats of culturally important species. Proceedings of the National Academy of Sciences, 120(0)</w:t>
+          <w:t>Biocultural vulnerability exposes threats of culturally important species. Proceedings of the National Academy of Sciences, 120(0)</w:t>
         </w:r>
       </w:hyperlink>
     </w:p>
@@ -862,9 +1017,12 @@
         <w:t>O’Hara, C. C.</w:t>
       </w:r>
       <w:r>
-        <w:t xml:space="preserve">, &amp; Halpern, B. S. (2022). </w:t>
-      </w:r>
-      <w:hyperlink r:id="rId11">
+        <w:t>, &amp; H</w:t>
+      </w:r>
+      <w:r>
+        <w:t xml:space="preserve">alpern, B. S. (2022). </w:t>
+      </w:r>
+      <w:hyperlink r:id="rId12">
         <w:r>
           <w:rPr>
             <w:rStyle w:val="Hyperlink"/>
@@ -888,12 +1046,21 @@
         <w:rPr>
           <w:b/>
         </w:rPr>
-        <w:t>O’Hara, C. C.</w:t>
-      </w:r>
-      <w:r>
-        <w:t xml:space="preserve">, Allcock, A. L., Polidoro, B., Sherman, S., Byrne, M., Birkeland, C., Dwyer, R. G., Frazier, M., Woodworth, B. K., Arango, C. P., Kingsford, M. J., Udyawer, V., Hutchings, P., Scanes, E., McClaren, E. J., Maxwell, S. M., Diaz-Pulido, G., … Klein, C. J. (2022). </w:t>
-      </w:r>
-      <w:hyperlink r:id="rId12">
+        <w:t>O’Hara,</w:t>
+      </w:r>
+      <w:r>
+        <w:rPr>
+          <w:b/>
+        </w:rPr>
+        <w:t xml:space="preserve"> C. C.</w:t>
+      </w:r>
+      <w:r>
+        <w:t>, Allcock, A. L., Polidoro, B., Sherman, S., Byrne, M., Birkeland, C., Dwyer, R. G., Frazier, M., Woodworth, B. K., Arango, C. P., Kingsford, M. J., Udyawer, V., Hutchings, P., Scanes, E., McClaren, E. J., Maxwell, S. M., Diaz-Pulido, G., … Klein, C.</w:t>
+      </w:r>
+      <w:r>
+        <w:t xml:space="preserve"> J. (2022). </w:t>
+      </w:r>
+      <w:hyperlink r:id="rId13">
         <w:r>
           <w:rPr>
             <w:rStyle w:val="Hyperlink"/>
@@ -914,13 +1081,12 @@
         <w:rPr>
           <w:b/>
         </w:rPr>
-        <w:lastRenderedPageBreak/>
         <w:t>O’Hara, C. C.</w:t>
       </w:r>
       <w:r>
         <w:t xml:space="preserve">, Frazier, M., &amp; Halpern, B. S. (2021). </w:t>
       </w:r>
-      <w:hyperlink r:id="rId13">
+      <w:hyperlink r:id="rId14">
         <w:r>
           <w:rPr>
             <w:rStyle w:val="Hyperlink"/>
@@ -949,41 +1115,18 @@
       <w:r>
         <w:t xml:space="preserve">, Scarborough, C., Hunter, K. L., Afflerbach, J. C., Bodtker, K., Frazier, M., Lowndes, J. S. S., Perry, R. I., &amp; Halpern, B. S. (2020). </w:t>
       </w:r>
-      <w:hyperlink r:id="rId14">
-        <w:r>
-          <w:rPr>
-            <w:rStyle w:val="Hyperlink"/>
-          </w:rPr>
-          <w:t>Changes in ocean health in British Columbia from 2001 to 2016. PLOS ONE, 15(1), e0227502.</w:t>
-        </w:r>
-      </w:hyperlink>
-    </w:p>
-    <w:p>
-      <w:pPr>
-        <w:pStyle w:val="Compact"/>
-        <w:numPr>
-          <w:ilvl w:val="0"/>
-          <w:numId w:val="9"/>
-        </w:numPr>
-      </w:pPr>
-      <w:r>
-        <w:t xml:space="preserve">Friedman, W. R., Halpern, B. S., McLeod, E., Beck, M. W., Duarte, C. M., Kappel, C. V., Levine, A., Sluka, R. D., Adler, S., </w:t>
-      </w:r>
-      <w:r>
-        <w:rPr>
-          <w:b/>
-        </w:rPr>
-        <w:t>O’Hara, C. C.</w:t>
-      </w:r>
-      <w:r>
-        <w:t xml:space="preserve">, Sterling, E. J., Tapia-Lewin, S., Losada, I. J., McClanahan, T. R., Pendleton, L., Spring, M., Toomey, J. P., Weiss, K. R., Possingham, H. P., &amp; Montambault, J. R. (2020). </w:t>
-      </w:r>
       <w:hyperlink r:id="rId15">
         <w:r>
           <w:rPr>
             <w:rStyle w:val="Hyperlink"/>
           </w:rPr>
-          <w:t>Research Priorities for Achieving Healthy Marine Ecosystems and Human Communities in a Changing Climate. Frontiers in Marine Science, 7.</w:t>
+          <w:t>Changes in ocean health in British Columbia from 2001 t</w:t>
+        </w:r>
+        <w:r>
+          <w:rPr>
+            <w:rStyle w:val="Hyperlink"/>
+          </w:rPr>
+          <w:t>o 2016. PLOS ONE, 15(1), e0227502.</w:t>
         </w:r>
       </w:hyperlink>
     </w:p>
@@ -996,7 +1139,7 @@
         </w:numPr>
       </w:pPr>
       <w:r>
-        <w:t xml:space="preserve">Halpern, B. S., Frazier, M., Afflerbach, J., Lowndes, J. S., Micheli, F., </w:t>
+        <w:t xml:space="preserve">Friedman, W. R., Halpern, B. S., McLeod, E., Beck, M. W., Duarte, C. M., Kappel, C. V., Levine, A., Sluka, R. D., Adler, S., </w:t>
       </w:r>
       <w:r>
         <w:rPr>
@@ -1005,14 +1148,23 @@
         <w:t>O’Hara, C. C.</w:t>
       </w:r>
       <w:r>
-        <w:t xml:space="preserve">, Scarborough, C., &amp; Selkoe, K. A. (2019). </w:t>
+        <w:t>, Sterling, E. J., Tapia-Lewin, S., Losada, I. J., McClanahan, T. R., Pendleton, L.</w:t>
+      </w:r>
+      <w:r>
+        <w:t xml:space="preserve">, Spring, M., Toomey, J. P., Weiss, K. R., Possingham, H. P., &amp; Montambault, J. R. (2020). </w:t>
       </w:r>
       <w:hyperlink r:id="rId16">
         <w:r>
           <w:rPr>
             <w:rStyle w:val="Hyperlink"/>
           </w:rPr>
-          <w:t>Recent pace of change in human impact on the world’s ocean. Scientific Reports, 9(1), 1–8.</w:t>
+          <w:t xml:space="preserve">Research Priorities for Achieving Healthy Marine Ecosystems and Human Communities in a Changing Climate. </w:t>
+        </w:r>
+        <w:r>
+          <w:rPr>
+            <w:rStyle w:val="Hyperlink"/>
+          </w:rPr>
+          <w:t>Frontiers in Marine Science, 7.</w:t>
         </w:r>
       </w:hyperlink>
     </w:p>
@@ -1025,12 +1177,47 @@
         </w:numPr>
       </w:pPr>
       <w:r>
+        <w:t xml:space="preserve">Halpern, B. S., Frazier, M., Afflerbach, J., Lowndes, J. S., Micheli, F., </w:t>
+      </w:r>
+      <w:r>
         <w:rPr>
           <w:b/>
         </w:rPr>
         <w:t>O’Hara, C. C.</w:t>
       </w:r>
       <w:r>
+        <w:t xml:space="preserve">, Scarborough, C., &amp; Selkoe, K. A. (2019). </w:t>
+      </w:r>
+      <w:hyperlink r:id="rId17">
+        <w:r>
+          <w:rPr>
+            <w:rStyle w:val="Hyperlink"/>
+          </w:rPr>
+          <w:t>Recent pace of change in human i</w:t>
+        </w:r>
+        <w:r>
+          <w:rPr>
+            <w:rStyle w:val="Hyperlink"/>
+          </w:rPr>
+          <w:t>mpact on the world’s ocean. Scientific Reports, 9(1), 1–8.</w:t>
+        </w:r>
+      </w:hyperlink>
+    </w:p>
+    <w:p>
+      <w:pPr>
+        <w:pStyle w:val="Compact"/>
+        <w:numPr>
+          <w:ilvl w:val="0"/>
+          <w:numId w:val="9"/>
+        </w:numPr>
+      </w:pPr>
+      <w:r>
+        <w:rPr>
+          <w:b/>
+        </w:rPr>
+        <w:t>O’Hara, C. C.</w:t>
+      </w:r>
+      <w:r>
         <w:t>, Villaseñor</w:t>
       </w:r>
       <w:r>
@@ -1042,7 +1229,7 @@
       <w:r>
         <w:t xml:space="preserve">Derbez, J. C., Ralph, G. M., &amp; Halpern, B. S. (2019). </w:t>
       </w:r>
-      <w:hyperlink r:id="rId17">
+      <w:hyperlink r:id="rId18">
         <w:r>
           <w:rPr>
             <w:rStyle w:val="Hyperlink"/>
@@ -1052,7 +1239,7 @@
         <w:r>
           <w:rPr>
             <w:rStyle w:val="Hyperlink"/>
-            <w:rFonts w:ascii="Cambria Math" w:hAnsi="Cambria Math" w:cs="Cambria Math"/>
+            <w:rFonts w:ascii="Times New Roman" w:hAnsi="Times New Roman" w:cs="Times New Roman"/>
           </w:rPr>
           <w:t>‐</w:t>
         </w:r>
@@ -1060,56 +1247,72 @@
           <w:rPr>
             <w:rStyle w:val="Hyperlink"/>
           </w:rPr>
-          <w:t>risk marine biodiversity. Conservation Letters, e12651.</w:t>
+          <w:t>risk marine biodiv</w:t>
         </w:r>
-      </w:hyperlink>
-    </w:p>
-    <w:p>
-      <w:pPr>
-        <w:pStyle w:val="Compact"/>
-        <w:numPr>
-          <w:ilvl w:val="0"/>
-          <w:numId w:val="9"/>
-        </w:numPr>
-      </w:pPr>
-      <w:r>
-        <w:t xml:space="preserve">Lowndes, J. S. S., Best, B. D., Scarborough, C., Afflerbach, J. C., Frazier, M. R., </w:t>
-      </w:r>
-      <w:r>
-        <w:rPr>
-          <w:b/>
-        </w:rPr>
-        <w:t>O’Hara, C. C.</w:t>
-      </w:r>
-      <w:r>
-        <w:t xml:space="preserve">, Jiang, N., &amp; Halpern, B. S. (2017). </w:t>
-      </w:r>
-      <w:hyperlink r:id="rId18">
         <w:r>
           <w:rPr>
             <w:rStyle w:val="Hyperlink"/>
           </w:rPr>
-          <w:t>Our path to better science in less time using open data science tools. Nature Ecology &amp; Evolution, 1(6), 0160.</w:t>
+          <w:t>ersity. Conservation Letters, e12651.</w:t>
         </w:r>
       </w:hyperlink>
     </w:p>
     <w:p>
       <w:pPr>
-        <w:pStyle w:val="Heading1"/>
-      </w:pPr>
-      <w:bookmarkStart w:id="13" w:name="_Toc191390238"/>
-      <w:bookmarkStart w:id="14" w:name="stem-education-and-engineering"/>
-      <w:bookmarkEnd w:id="12"/>
-      <w:r>
+        <w:pStyle w:val="Compact"/>
+        <w:numPr>
+          <w:ilvl w:val="0"/>
+          <w:numId w:val="9"/>
+        </w:numPr>
+      </w:pPr>
+      <w:r>
+        <w:t xml:space="preserve">Lowndes, J. S. S., Best, B. D., Scarborough, C., Afflerbach, J. C., Frazier, M. R., </w:t>
+      </w:r>
+      <w:r>
+        <w:rPr>
+          <w:b/>
+        </w:rPr>
+        <w:t>O’Hara, C. C.</w:t>
+      </w:r>
+      <w:r>
+        <w:t xml:space="preserve">, Jiang, N., &amp; Halpern, B. S. (2017). </w:t>
+      </w:r>
+      <w:hyperlink r:id="rId19">
+        <w:r>
+          <w:rPr>
+            <w:rStyle w:val="Hyperlink"/>
+          </w:rPr>
+          <w:t>Our path to better scien</w:t>
+        </w:r>
+        <w:r>
+          <w:rPr>
+            <w:rStyle w:val="Hyperlink"/>
+          </w:rPr>
+          <w:t>ce in less time using open data science tools. Nature Ecology &amp; Evolution, 1(6), 0160.</w:t>
+        </w:r>
+      </w:hyperlink>
+    </w:p>
+    <w:p>
+      <w:r>
+        <w:br w:type="page"/>
+      </w:r>
+    </w:p>
+    <w:p>
+      <w:pPr>
+        <w:pStyle w:val="Heading2"/>
+      </w:pPr>
+      <w:bookmarkStart w:id="7" w:name="stem-education-and-engineering"/>
+      <w:bookmarkEnd w:id="6"/>
+      <w:r>
+        <w:lastRenderedPageBreak/>
         <w:t>STEM education and engineering</w:t>
       </w:r>
-      <w:bookmarkEnd w:id="13"/>
     </w:p>
     <w:p>
       <w:pPr>
         <w:pStyle w:val="Heading3"/>
       </w:pPr>
-      <w:bookmarkStart w:id="15" w:name="secondary-education-experience"/>
+      <w:bookmarkStart w:id="8" w:name="secondary-education-experience"/>
       <w:r>
         <w:t>Secondary education experience</w:t>
       </w:r>
@@ -1119,11 +1322,63 @@
         <w:pStyle w:val="Compact"/>
         <w:numPr>
           <w:ilvl w:val="0"/>
+          <w:numId w:val="10"/>
+        </w:numPr>
+      </w:pPr>
+      <w:r>
+        <w:t>Program Consultant (June 2013 - August 2013) The School for Examining Essential Questions of Sustainabili</w:t>
+      </w:r>
+      <w:r>
+        <w:t>ty (SEEQS) Charter School - Honolulu, HI</w:t>
+      </w:r>
+    </w:p>
+    <w:p>
+      <w:pPr>
+        <w:pStyle w:val="Compact"/>
+        <w:numPr>
+          <w:ilvl w:val="0"/>
+          <w:numId w:val="10"/>
+        </w:numPr>
+      </w:pPr>
+      <w:r>
+        <w:t>Science Teacher: Physics, Integrated Science, Engineering &amp; Green Tech (August 2004 - June 2012) Carlmont High School - Belmont, CA</w:t>
+      </w:r>
+    </w:p>
+    <w:p>
+      <w:pPr>
+        <w:pStyle w:val="Compact"/>
+        <w:numPr>
+          <w:ilvl w:val="0"/>
+          <w:numId w:val="10"/>
+        </w:numPr>
+      </w:pPr>
+      <w:r>
+        <w:t>Education Liaison (November 2009 - December 2009) Amundsen-Scott South Pole Station</w:t>
+      </w:r>
+      <w:r>
+        <w:t>, Antarctica</w:t>
+      </w:r>
+    </w:p>
+    <w:p>
+      <w:pPr>
+        <w:pStyle w:val="Heading3"/>
+      </w:pPr>
+      <w:bookmarkStart w:id="9" w:name="Xad93891d9add55656d4afc9efaad00ffe171970"/>
+      <w:bookmarkEnd w:id="8"/>
+      <w:r>
+        <w:t>Secondary education leadership and honors</w:t>
+      </w:r>
+    </w:p>
+    <w:p>
+      <w:pPr>
+        <w:pStyle w:val="Compact"/>
+        <w:numPr>
+          <w:ilvl w:val="0"/>
           <w:numId w:val="11"/>
         </w:numPr>
       </w:pPr>
       <w:r>
-        <w:t>Program Consultant (June 2013 - August 2013) The School for Examining Essential Questions of Sustainability (SEEQS) Charter School - Honolulu, HI</w:t>
+        <w:t>“Where the Wonder Went” documentary short film, Santa Barbara International Film Festival (2014)</w:t>
       </w:r>
     </w:p>
     <w:p>
@@ -1135,7 +1390,7 @@
         </w:numPr>
       </w:pPr>
       <w:r>
-        <w:t>Science Teacher: Physics, Integrated Science, Engineering &amp; Green Tech (August 2004 - June 2012) Carlmont High School - Belmont, CA</w:t>
+        <w:t>Senior Fellow, Knowles Science Teaching Foundation (2009 - present)</w:t>
       </w:r>
     </w:p>
     <w:p>
@@ -1147,17 +1402,71 @@
         </w:numPr>
       </w:pPr>
       <w:r>
-        <w:t>Education Liaison (November 2009 - December 2009) Amundsen-Scott South Pole Station, Antarctica</w:t>
+        <w:t>Teaching Fellow, Knowles Science Tea</w:t>
+      </w:r>
+      <w:r>
+        <w:t>ching Foundation (2004 - 2009)</w:t>
+      </w:r>
+    </w:p>
+    <w:p>
+      <w:pPr>
+        <w:pStyle w:val="Compact"/>
+        <w:numPr>
+          <w:ilvl w:val="0"/>
+          <w:numId w:val="11"/>
+        </w:numPr>
+      </w:pPr>
+      <w:r>
+        <w:t>Exploratorium Teacher Institute (2004 - 2013)</w:t>
+      </w:r>
+    </w:p>
+    <w:p>
+      <w:pPr>
+        <w:pStyle w:val="Compact"/>
+        <w:numPr>
+          <w:ilvl w:val="0"/>
+          <w:numId w:val="11"/>
+        </w:numPr>
+      </w:pPr>
+      <w:r>
+        <w:t>Innovative Teacher of the Year, Carlmont High School (2011)</w:t>
+      </w:r>
+    </w:p>
+    <w:p>
+      <w:pPr>
+        <w:pStyle w:val="Compact"/>
+        <w:numPr>
+          <w:ilvl w:val="0"/>
+          <w:numId w:val="11"/>
+        </w:numPr>
+      </w:pPr>
+      <w:r>
+        <w:t>Amgen Award for Science Teaching Excellence (2011)</w:t>
+      </w:r>
+    </w:p>
+    <w:p>
+      <w:pPr>
+        <w:pStyle w:val="Compact"/>
+        <w:numPr>
+          <w:ilvl w:val="0"/>
+          <w:numId w:val="11"/>
+        </w:numPr>
+      </w:pPr>
+      <w:r>
+        <w:t>Certification: National Board for Professional Teaching Standards (S</w:t>
+      </w:r>
+      <w:r>
+        <w:t>cience - Adolescent/Young Adult) (2009)</w:t>
       </w:r>
     </w:p>
     <w:p>
       <w:pPr>
         <w:pStyle w:val="Heading3"/>
       </w:pPr>
-      <w:bookmarkStart w:id="16" w:name="Xad93891d9add55656d4afc9efaad00ffe171970"/>
-      <w:bookmarkEnd w:id="15"/>
-      <w:r>
-        <w:t>Secondary education leadership and honors</w:t>
+      <w:bookmarkStart w:id="10" w:name="engineering-experience"/>
+      <w:bookmarkEnd w:id="9"/>
+      <w:r>
+        <w:t>Engineering experience</w:t>
       </w:r>
     </w:p>
     <w:p>
@@ -1169,7 +1478,7 @@
         </w:numPr>
       </w:pPr>
       <w:r>
-        <w:t>“Where the Wonder Went” documentary short film, Santa Barbara International Film Festival (2014)</w:t>
+        <w:t>Mechanical Engineer (May 2000 - December 2003) St. Jude Medical, Inc. - Sunnyvale, CA</w:t>
       </w:r>
     </w:p>
     <w:p>
@@ -1181,7 +1490,7 @@
         </w:numPr>
       </w:pPr>
       <w:r>
-        <w:t>Senior Fellow, Knowles Science Teaching Foundation (2009 - present)</w:t>
+        <w:t>Mechanical Engineer (May 1997 - May 2000) Asyst Technologies (Hine Design) - Sunnyvale, CA</w:t>
       </w:r>
     </w:p>
     <w:p>
@@ -1193,7 +1502,7 @@
         </w:numPr>
       </w:pPr>
       <w:r>
-        <w:t>Teaching Fellow, Knowles Science Teaching Foundation (2004 - 2009)</w:t>
+        <w:t>Mechanical Engineer (August 1995 - April 1997) Applied Materials, Inc. - Santa Clara, CA</w:t>
       </w:r>
     </w:p>
     <w:p>
@@ -1205,109 +1514,10 @@
         </w:numPr>
       </w:pPr>
       <w:r>
-        <w:t>Exploratorium Teacher Institute (2004 - 2013)</w:t>
-      </w:r>
-    </w:p>
-    <w:p>
-      <w:pPr>
-        <w:pStyle w:val="Compact"/>
-        <w:numPr>
-          <w:ilvl w:val="0"/>
-          <w:numId w:val="12"/>
-        </w:numPr>
-      </w:pPr>
-      <w:r>
-        <w:t>Innovative Teacher of the Year, Carlmont High School (2011)</w:t>
-      </w:r>
-    </w:p>
-    <w:p>
-      <w:pPr>
-        <w:pStyle w:val="Compact"/>
-        <w:numPr>
-          <w:ilvl w:val="0"/>
-          <w:numId w:val="12"/>
-        </w:numPr>
-      </w:pPr>
-      <w:r>
-        <w:t>Amgen Award for Science Teaching Excellence (2011)</w:t>
-      </w:r>
-    </w:p>
-    <w:p>
-      <w:pPr>
-        <w:pStyle w:val="Compact"/>
-        <w:numPr>
-          <w:ilvl w:val="0"/>
-          <w:numId w:val="12"/>
-        </w:numPr>
-      </w:pPr>
-      <w:r>
-        <w:t>Certification: National Board for Professional Teaching Standards (Science - Adolescent/Young Adult) (2009)</w:t>
-      </w:r>
-    </w:p>
-    <w:p>
-      <w:pPr>
-        <w:pStyle w:val="Heading3"/>
-      </w:pPr>
-      <w:bookmarkStart w:id="17" w:name="engineering-experience"/>
-      <w:bookmarkEnd w:id="16"/>
-      <w:r>
-        <w:t>Engineering experience</w:t>
-      </w:r>
-    </w:p>
-    <w:p>
-      <w:pPr>
-        <w:pStyle w:val="Compact"/>
-        <w:numPr>
-          <w:ilvl w:val="0"/>
-          <w:numId w:val="13"/>
-        </w:numPr>
-      </w:pPr>
-      <w:r>
-        <w:t>Mechanical Engineer (May 2000 - December 2003) St. Jude Medical, Inc. - Sunnyvale, CA</w:t>
-      </w:r>
-    </w:p>
-    <w:p>
-      <w:pPr>
-        <w:pStyle w:val="Compact"/>
-        <w:numPr>
-          <w:ilvl w:val="0"/>
-          <w:numId w:val="13"/>
-        </w:numPr>
-      </w:pPr>
-      <w:r>
-        <w:t>Mechanical Engineer (May 1997 - May 2000) Asyst Technologies (Hine Design) - Sunnyvale, CA</w:t>
-      </w:r>
-    </w:p>
-    <w:p>
-      <w:pPr>
-        <w:pStyle w:val="Compact"/>
-        <w:numPr>
-          <w:ilvl w:val="0"/>
-          <w:numId w:val="13"/>
-        </w:numPr>
-      </w:pPr>
-      <w:r>
-        <w:t>Mechanical Engineer (August 1995 - April 1997) Applied Materials, Inc. - Santa Clara, CA</w:t>
-      </w:r>
-    </w:p>
-    <w:p>
-      <w:pPr>
-        <w:pStyle w:val="Compact"/>
-        <w:numPr>
-          <w:ilvl w:val="0"/>
-          <w:numId w:val="13"/>
-        </w:numPr>
-      </w:pPr>
-      <w:r>
-        <w:t>Maintenance Engineer (August</w:t>
-      </w:r>
-      <w:r>
-        <w:t xml:space="preserve"> 1994 - August 1995) ATMEL Inc. - San Jose, CA</w:t>
-      </w:r>
-      <w:bookmarkStart w:id="18" w:name="pdf-version-of-cv"/>
-      <w:bookmarkEnd w:id="14"/>
-      <w:bookmarkEnd w:id="17"/>
-      <w:bookmarkEnd w:id="18"/>
+        <w:t>Maintenance Engineer (August 1994 - August 1995) ATMEL Inc. - San Jose, CA</w:t>
+      </w:r>
+      <w:bookmarkEnd w:id="7"/>
+      <w:bookmarkEnd w:id="10"/>
     </w:p>
     <w:sectPr>
       <w:pgSz w:w="12240" w:h="15840"/>
@@ -1324,7 +1534,7 @@
   <w:abstractNum w:abstractNumId="0" w15:restartNumberingAfterBreak="0">
     <w:nsid w:val="0000A990"/>
     <w:multiLevelType w:val="multilevel"/>
-    <w:tmpl w:val="503EC208"/>
+    <w:tmpl w:val="80F0E0C6"/>
     <w:lvl w:ilvl="0">
       <w:numFmt w:val="bullet"/>
       <w:lvlText w:val=" "/>
@@ -1401,7 +1611,7 @@
   <w:abstractNum w:abstractNumId="1" w15:restartNumberingAfterBreak="0">
     <w:nsid w:val="0000A991"/>
     <w:multiLevelType w:val="multilevel"/>
-    <w:tmpl w:val="3DD20762"/>
+    <w:tmpl w:val="C4301842"/>
     <w:lvl w:ilvl="0">
       <w:numFmt w:val="bullet"/>
       <w:lvlText w:val=""/>
@@ -1499,119 +1709,6 @@
       </w:pPr>
       <w:rPr>
         <w:rFonts w:ascii="Wingdings" w:hAnsi="Wingdings" w:cs="Wingdings" w:hint="default"/>
-      </w:rPr>
-    </w:lvl>
-  </w:abstractNum>
-  <w:abstractNum w:abstractNumId="2" w15:restartNumberingAfterBreak="0">
-    <w:nsid w:val="56DB4A66"/>
-    <w:multiLevelType w:val="hybridMultilevel"/>
-    <w:tmpl w:val="BE36CD8C"/>
-    <w:lvl w:ilvl="0" w:tplc="04090001">
-      <w:start w:val="1"/>
-      <w:numFmt w:val="bullet"/>
-      <w:lvlText w:val=""/>
-      <w:lvlJc w:val="left"/>
-      <w:pPr>
-        <w:ind w:left="720" w:hanging="360"/>
-      </w:pPr>
-      <w:rPr>
-        <w:rFonts w:ascii="Symbol" w:hAnsi="Symbol" w:hint="default"/>
-      </w:rPr>
-    </w:lvl>
-    <w:lvl w:ilvl="1" w:tplc="04090003" w:tentative="1">
-      <w:start w:val="1"/>
-      <w:numFmt w:val="bullet"/>
-      <w:lvlText w:val="o"/>
-      <w:lvlJc w:val="left"/>
-      <w:pPr>
-        <w:ind w:left="1440" w:hanging="360"/>
-      </w:pPr>
-      <w:rPr>
-        <w:rFonts w:ascii="Courier New" w:hAnsi="Courier New" w:cs="Courier New" w:hint="default"/>
-      </w:rPr>
-    </w:lvl>
-    <w:lvl w:ilvl="2" w:tplc="04090005" w:tentative="1">
-      <w:start w:val="1"/>
-      <w:numFmt w:val="bullet"/>
-      <w:lvlText w:val=""/>
-      <w:lvlJc w:val="left"/>
-      <w:pPr>
-        <w:ind w:left="2160" w:hanging="360"/>
-      </w:pPr>
-      <w:rPr>
-        <w:rFonts w:ascii="Wingdings" w:hAnsi="Wingdings" w:hint="default"/>
-      </w:rPr>
-    </w:lvl>
-    <w:lvl w:ilvl="3" w:tplc="04090001" w:tentative="1">
-      <w:start w:val="1"/>
-      <w:numFmt w:val="bullet"/>
-      <w:lvlText w:val=""/>
-      <w:lvlJc w:val="left"/>
-      <w:pPr>
-        <w:ind w:left="2880" w:hanging="360"/>
-      </w:pPr>
-      <w:rPr>
-        <w:rFonts w:ascii="Symbol" w:hAnsi="Symbol" w:hint="default"/>
-      </w:rPr>
-    </w:lvl>
-    <w:lvl w:ilvl="4" w:tplc="04090003" w:tentative="1">
-      <w:start w:val="1"/>
-      <w:numFmt w:val="bullet"/>
-      <w:lvlText w:val="o"/>
-      <w:lvlJc w:val="left"/>
-      <w:pPr>
-        <w:ind w:left="3600" w:hanging="360"/>
-      </w:pPr>
-      <w:rPr>
-        <w:rFonts w:ascii="Courier New" w:hAnsi="Courier New" w:cs="Courier New" w:hint="default"/>
-      </w:rPr>
-    </w:lvl>
-    <w:lvl w:ilvl="5" w:tplc="04090005" w:tentative="1">
-      <w:start w:val="1"/>
-      <w:numFmt w:val="bullet"/>
-      <w:lvlText w:val=""/>
-      <w:lvlJc w:val="left"/>
-      <w:pPr>
-        <w:ind w:left="4320" w:hanging="360"/>
-      </w:pPr>
-      <w:rPr>
-        <w:rFonts w:ascii="Wingdings" w:hAnsi="Wingdings" w:hint="default"/>
-      </w:rPr>
-    </w:lvl>
-    <w:lvl w:ilvl="6" w:tplc="04090001" w:tentative="1">
-      <w:start w:val="1"/>
-      <w:numFmt w:val="bullet"/>
-      <w:lvlText w:val=""/>
-      <w:lvlJc w:val="left"/>
-      <w:pPr>
-        <w:ind w:left="5040" w:hanging="360"/>
-      </w:pPr>
-      <w:rPr>
-        <w:rFonts w:ascii="Symbol" w:hAnsi="Symbol" w:hint="default"/>
-      </w:rPr>
-    </w:lvl>
-    <w:lvl w:ilvl="7" w:tplc="04090003" w:tentative="1">
-      <w:start w:val="1"/>
-      <w:numFmt w:val="bullet"/>
-      <w:lvlText w:val="o"/>
-      <w:lvlJc w:val="left"/>
-      <w:pPr>
-        <w:ind w:left="5760" w:hanging="360"/>
-      </w:pPr>
-      <w:rPr>
-        <w:rFonts w:ascii="Courier New" w:hAnsi="Courier New" w:cs="Courier New" w:hint="default"/>
-      </w:rPr>
-    </w:lvl>
-    <w:lvl w:ilvl="8" w:tplc="04090005" w:tentative="1">
-      <w:start w:val="1"/>
-      <w:numFmt w:val="bullet"/>
-      <w:lvlText w:val=""/>
-      <w:lvlJc w:val="left"/>
-      <w:pPr>
-        <w:ind w:left="6480" w:hanging="360"/>
-      </w:pPr>
-      <w:rPr>
-        <w:rFonts w:ascii="Wingdings" w:hAnsi="Wingdings" w:hint="default"/>
       </w:rPr>
     </w:lvl>
   </w:abstractNum>
@@ -1651,12 +1748,6 @@
   <w:num w:numId="12">
     <w:abstractNumId w:val="1"/>
   </w:num>
-  <w:num w:numId="13">
-    <w:abstractNumId w:val="1"/>
-  </w:num>
-  <w:num w:numId="14">
-    <w:abstractNumId w:val="2"/>
-  </w:num>
 </w:numbering>
 </file>
 
@@ -1683,7 +1774,7 @@
     <w:lsdException w:name="index 8" w:semiHidden="1" w:unhideWhenUsed="1"/>
     <w:lsdException w:name="index 9" w:semiHidden="1" w:unhideWhenUsed="1"/>
     <w:lsdException w:name="toc 1" w:semiHidden="1" w:unhideWhenUsed="1"/>
-    <w:lsdException w:name="toc 2" w:semiHidden="1" w:uiPriority="39" w:unhideWhenUsed="1"/>
+    <w:lsdException w:name="toc 2" w:semiHidden="1" w:unhideWhenUsed="1"/>
     <w:lsdException w:name="toc 3" w:semiHidden="1" w:unhideWhenUsed="1"/>
     <w:lsdException w:name="toc 4" w:semiHidden="1" w:unhideWhenUsed="1"/>
     <w:lsdException w:name="toc 5" w:semiHidden="1" w:unhideWhenUsed="1"/>
@@ -1742,7 +1833,6 @@
     <w:lsdException w:name="Body Text 2" w:semiHidden="1" w:unhideWhenUsed="1"/>
     <w:lsdException w:name="Body Text 3" w:semiHidden="1" w:unhideWhenUsed="1"/>
     <w:lsdException w:name="Body Text Indent 2" w:semiHidden="1" w:unhideWhenUsed="1"/>
-    <w:lsdException w:name="Hyperlink" w:uiPriority="99"/>
     <w:lsdException w:name="Document Map" w:semiHidden="1" w:unhideWhenUsed="1"/>
     <w:lsdException w:name="Plain Text" w:semiHidden="1" w:unhideWhenUsed="1"/>
     <w:lsdException w:name="E-mail Signature" w:semiHidden="1" w:unhideWhenUsed="1"/>
@@ -1817,13 +1907,6 @@
     <w:lsdException w:name="Medium Shading 2"/>
     <w:lsdException w:name="Medium List 1"/>
     <w:lsdException w:name="Medium List 2"/>
-    <w:lsdException w:name="Medium Grid 1"/>
-    <w:lsdException w:name="Medium Grid 2"/>
-    <w:lsdException w:name="Medium Grid 3"/>
-    <w:lsdException w:name="Dark List"/>
-    <w:lsdException w:name="Colorful Shading"/>
-    <w:lsdException w:name="Colorful List"/>
-    <w:lsdException w:name="Colorful Grid"/>
     <w:lsdException w:name="Light Shading Accent 1"/>
     <w:lsdException w:name="Light List Accent 1"/>
     <w:lsdException w:name="Light Grid Accent 1"/>
@@ -2010,28 +2093,34 @@
   <w:style w:type="paragraph" w:default="1" w:styleId="Normal">
     <w:name w:val="Normal"/>
     <w:qFormat/>
+    <w:rsid w:val="00611C36"/>
+    <w:pPr>
+      <w:spacing w:before="180" w:after="180"/>
+    </w:pPr>
+    <w:rPr>
+      <w:rFonts w:ascii="Garamond" w:hAnsi="Garamond"/>
+      <w:bCs/>
+    </w:rPr>
   </w:style>
   <w:style w:type="paragraph" w:styleId="Heading1">
     <w:name w:val="heading 1"/>
-    <w:basedOn w:val="Heading2"/>
+    <w:basedOn w:val="Normal"/>
     <w:next w:val="BodyText"/>
     <w:link w:val="Heading1Char"/>
     <w:uiPriority w:val="9"/>
     <w:qFormat/>
-    <w:rsid w:val="0069466E"/>
+    <w:rsid w:val="00A10FD9"/>
     <w:pPr>
-      <w:pBdr>
-        <w:bottom w:val="single" w:sz="4" w:space="1" w:color="auto"/>
-      </w:pBdr>
-      <w:spacing w:after="0"/>
+      <w:keepNext/>
+      <w:keepLines/>
+      <w:spacing w:before="360" w:after="80"/>
       <w:outlineLvl w:val="0"/>
     </w:pPr>
     <w:rPr>
-      <w:rFonts w:ascii="Century Gothic" w:hAnsi="Century Gothic"/>
-      <w:b/>
-      <w:color w:val="auto"/>
-      <w:sz w:val="28"/>
-      <w:szCs w:val="28"/>
+      <w:rFonts w:asciiTheme="majorHAnsi" w:eastAsiaTheme="majorEastAsia" w:hAnsiTheme="majorHAnsi" w:cstheme="majorBidi"/>
+      <w:color w:val="0F4761" w:themeColor="accent1" w:themeShade="BF"/>
+      <w:sz w:val="40"/>
+      <w:szCs w:val="40"/>
     </w:rPr>
   </w:style>
   <w:style w:type="paragraph" w:styleId="Heading2">
@@ -2040,19 +2129,22 @@
     <w:next w:val="BodyText"/>
     <w:link w:val="Heading2Char"/>
     <w:uiPriority w:val="9"/>
-    <w:semiHidden/>
     <w:unhideWhenUsed/>
     <w:qFormat/>
-    <w:rsid w:val="00A10FD9"/>
+    <w:rsid w:val="00611C36"/>
     <w:pPr>
       <w:keepNext/>
       <w:keepLines/>
+      <w:pBdr>
+        <w:bottom w:val="single" w:sz="4" w:space="1" w:color="auto"/>
+      </w:pBdr>
       <w:spacing w:before="160" w:after="80"/>
       <w:outlineLvl w:val="1"/>
     </w:pPr>
     <w:rPr>
-      <w:rFonts w:asciiTheme="majorHAnsi" w:eastAsiaTheme="majorEastAsia" w:hAnsiTheme="majorHAnsi" w:cstheme="majorBidi"/>
-      <w:color w:val="0F4761" w:themeColor="accent1" w:themeShade="BF"/>
+      <w:rFonts w:ascii="Century Gothic" w:eastAsiaTheme="majorEastAsia" w:hAnsi="Century Gothic" w:cstheme="majorBidi"/>
+      <w:b/>
+      <w:spacing w:val="-10"/>
       <w:sz w:val="32"/>
       <w:szCs w:val="32"/>
     </w:rPr>
@@ -2065,7 +2157,7 @@
     <w:uiPriority w:val="9"/>
     <w:unhideWhenUsed/>
     <w:qFormat/>
-    <w:rsid w:val="0069466E"/>
+    <w:rsid w:val="00611C36"/>
     <w:pPr>
       <w:keepNext/>
       <w:keepLines/>
@@ -2240,23 +2332,12 @@
     <w:name w:val="Body Text"/>
     <w:basedOn w:val="Normal"/>
     <w:qFormat/>
-    <w:rsid w:val="0069466E"/>
-    <w:pPr>
-      <w:spacing w:before="120" w:after="120"/>
-    </w:pPr>
-    <w:rPr>
-      <w:rFonts w:ascii="Garamond" w:hAnsi="Garamond"/>
-      <w:bCs/>
-      <w:sz w:val="22"/>
-      <w:szCs w:val="22"/>
-    </w:rPr>
   </w:style>
   <w:style w:type="paragraph" w:customStyle="1" w:styleId="FirstParagraph">
     <w:name w:val="First Paragraph"/>
     <w:basedOn w:val="BodyText"/>
     <w:next w:val="BodyText"/>
     <w:qFormat/>
-    <w:rsid w:val="0069466E"/>
   </w:style>
   <w:style w:type="paragraph" w:customStyle="1" w:styleId="Compact">
     <w:name w:val="Compact"/>
@@ -2303,7 +2384,7 @@
   </w:style>
   <w:style w:type="paragraph" w:styleId="Subtitle">
     <w:name w:val="Subtitle"/>
-    <w:basedOn w:val="Normal"/>
+    <w:basedOn w:val="Title"/>
     <w:next w:val="BodyText"/>
     <w:link w:val="SubtitleChar"/>
     <w:uiPriority w:val="11"/>
@@ -2315,8 +2396,6 @@
       </w:numPr>
     </w:pPr>
     <w:rPr>
-      <w:rFonts w:eastAsiaTheme="majorEastAsia" w:cstheme="majorBidi"/>
-      <w:color w:val="595959" w:themeColor="text1" w:themeTint="A6"/>
       <w:spacing w:val="15"/>
       <w:sz w:val="28"/>
       <w:szCs w:val="28"/>
@@ -2369,7 +2448,6 @@
     </w:pPr>
     <w:rPr>
       <w:b/>
-      <w:color w:val="345A8A"/>
       <w:sz w:val="20"/>
       <w:szCs w:val="20"/>
     </w:rPr>
@@ -2399,12 +2477,12 @@
     <w:basedOn w:val="DefaultParagraphFont"/>
     <w:link w:val="Heading1"/>
     <w:uiPriority w:val="9"/>
-    <w:rsid w:val="0069466E"/>
-    <w:rPr>
-      <w:rFonts w:ascii="Century Gothic" w:eastAsiaTheme="majorEastAsia" w:hAnsi="Century Gothic" w:cstheme="majorBidi"/>
-      <w:b/>
-      <w:sz w:val="28"/>
-      <w:szCs w:val="28"/>
+    <w:rsid w:val="00A10FD9"/>
+    <w:rPr>
+      <w:rFonts w:asciiTheme="majorHAnsi" w:eastAsiaTheme="majorEastAsia" w:hAnsiTheme="majorHAnsi" w:cstheme="majorBidi"/>
+      <w:color w:val="0F4761" w:themeColor="accent1" w:themeShade="BF"/>
+      <w:sz w:val="40"/>
+      <w:szCs w:val="40"/>
     </w:rPr>
   </w:style>
   <w:style w:type="character" w:customStyle="1" w:styleId="Heading2Char">
@@ -2412,11 +2490,12 @@
     <w:basedOn w:val="DefaultParagraphFont"/>
     <w:link w:val="Heading2"/>
     <w:uiPriority w:val="9"/>
-    <w:semiHidden/>
-    <w:rsid w:val="00A10FD9"/>
-    <w:rPr>
-      <w:rFonts w:asciiTheme="majorHAnsi" w:eastAsiaTheme="majorEastAsia" w:hAnsiTheme="majorHAnsi" w:cstheme="majorBidi"/>
-      <w:color w:val="0F4761" w:themeColor="accent1" w:themeShade="BF"/>
+    <w:rsid w:val="00611C36"/>
+    <w:rPr>
+      <w:rFonts w:ascii="Century Gothic" w:eastAsiaTheme="majorEastAsia" w:hAnsi="Century Gothic" w:cstheme="majorBidi"/>
+      <w:b/>
+      <w:bCs/>
+      <w:spacing w:val="-10"/>
       <w:sz w:val="32"/>
       <w:szCs w:val="32"/>
     </w:rPr>
@@ -2426,10 +2505,11 @@
     <w:basedOn w:val="DefaultParagraphFont"/>
     <w:link w:val="Heading3"/>
     <w:uiPriority w:val="9"/>
-    <w:rsid w:val="0069466E"/>
+    <w:rsid w:val="00611C36"/>
     <w:rPr>
       <w:rFonts w:ascii="Century Gothic" w:eastAsiaTheme="majorEastAsia" w:hAnsi="Century Gothic" w:cstheme="majorBidi"/>
       <w:b/>
+      <w:bCs/>
     </w:rPr>
   </w:style>
   <w:style w:type="character" w:customStyle="1" w:styleId="Heading4Char">
@@ -2592,7 +2672,7 @@
     <w:basedOn w:val="Normal"/>
     <w:link w:val="CaptionChar"/>
     <w:pPr>
-      <w:spacing w:after="120"/>
+      <w:spacing w:before="0" w:after="120"/>
     </w:pPr>
     <w:rPr>
       <w:i/>
@@ -2648,7 +2728,6 @@
   <w:style w:type="character" w:styleId="Hyperlink">
     <w:name w:val="Hyperlink"/>
     <w:basedOn w:val="CaptionChar"/>
-    <w:uiPriority w:val="99"/>
     <w:rPr>
       <w:color w:val="156082" w:themeColor="accent1"/>
     </w:rPr>
@@ -2664,17 +2743,13 @@
       <w:spacing w:before="240" w:line="259" w:lineRule="auto"/>
       <w:outlineLvl w:val="9"/>
     </w:pPr>
-    <w:rPr>
-      <w:rFonts w:asciiTheme="majorHAnsi" w:hAnsiTheme="majorHAnsi"/>
-      <w:color w:val="0F4761" w:themeColor="accent1" w:themeShade="BF"/>
-    </w:rPr>
   </w:style>
   <w:style w:type="paragraph" w:customStyle="1" w:styleId="SourceCode">
     <w:name w:val="Source Code"/>
     <w:basedOn w:val="Normal"/>
     <w:link w:val="VerbatimChar"/>
     <w:pPr>
-      <w:shd w:val="clear" w:color="auto" w:fill="F8F8F8"/>
+      <w:shd w:val="clear" w:color="auto" w:fill="F1F3F5"/>
       <w:wordWrap w:val="0"/>
     </w:pPr>
   </w:style>
@@ -2684,9 +2759,9 @@
     <w:rPr>
       <w:rFonts w:ascii="Consolas" w:hAnsi="Consolas"/>
       <w:b/>
-      <w:color w:val="204A87"/>
+      <w:color w:val="003B4F"/>
       <w:sz w:val="22"/>
-      <w:shd w:val="clear" w:color="auto" w:fill="F8F8F8"/>
+      <w:shd w:val="clear" w:color="auto" w:fill="F1F3F5"/>
     </w:rPr>
   </w:style>
   <w:style w:type="character" w:customStyle="1" w:styleId="DataTypeTok">
@@ -2694,9 +2769,9 @@
     <w:basedOn w:val="VerbatimChar"/>
     <w:rPr>
       <w:rFonts w:ascii="Consolas" w:hAnsi="Consolas"/>
-      <w:color w:val="204A87"/>
+      <w:color w:val="AD0000"/>
       <w:sz w:val="22"/>
-      <w:shd w:val="clear" w:color="auto" w:fill="F8F8F8"/>
+      <w:shd w:val="clear" w:color="auto" w:fill="F1F3F5"/>
     </w:rPr>
   </w:style>
   <w:style w:type="character" w:customStyle="1" w:styleId="DecValTok">
@@ -2704,9 +2779,9 @@
     <w:basedOn w:val="VerbatimChar"/>
     <w:rPr>
       <w:rFonts w:ascii="Consolas" w:hAnsi="Consolas"/>
-      <w:color w:val="0000CF"/>
+      <w:color w:val="AD0000"/>
       <w:sz w:val="22"/>
-      <w:shd w:val="clear" w:color="auto" w:fill="F8F8F8"/>
+      <w:shd w:val="clear" w:color="auto" w:fill="F1F3F5"/>
     </w:rPr>
   </w:style>
   <w:style w:type="character" w:customStyle="1" w:styleId="BaseNTok">
@@ -2714,9 +2789,9 @@
     <w:basedOn w:val="VerbatimChar"/>
     <w:rPr>
       <w:rFonts w:ascii="Consolas" w:hAnsi="Consolas"/>
-      <w:color w:val="0000CF"/>
+      <w:color w:val="AD0000"/>
       <w:sz w:val="22"/>
-      <w:shd w:val="clear" w:color="auto" w:fill="F8F8F8"/>
+      <w:shd w:val="clear" w:color="auto" w:fill="F1F3F5"/>
     </w:rPr>
   </w:style>
   <w:style w:type="character" w:customStyle="1" w:styleId="FloatTok">
@@ -2724,9 +2799,9 @@
     <w:basedOn w:val="VerbatimChar"/>
     <w:rPr>
       <w:rFonts w:ascii="Consolas" w:hAnsi="Consolas"/>
-      <w:color w:val="0000CF"/>
+      <w:color w:val="AD0000"/>
       <w:sz w:val="22"/>
-      <w:shd w:val="clear" w:color="auto" w:fill="F8F8F8"/>
+      <w:shd w:val="clear" w:color="auto" w:fill="F1F3F5"/>
     </w:rPr>
   </w:style>
   <w:style w:type="character" w:customStyle="1" w:styleId="ConstantTok">
@@ -2736,7 +2811,7 @@
       <w:rFonts w:ascii="Consolas" w:hAnsi="Consolas"/>
       <w:color w:val="8F5902"/>
       <w:sz w:val="22"/>
-      <w:shd w:val="clear" w:color="auto" w:fill="F8F8F8"/>
+      <w:shd w:val="clear" w:color="auto" w:fill="F1F3F5"/>
     </w:rPr>
   </w:style>
   <w:style w:type="character" w:customStyle="1" w:styleId="CharTok">
@@ -2744,9 +2819,9 @@
     <w:basedOn w:val="VerbatimChar"/>
     <w:rPr>
       <w:rFonts w:ascii="Consolas" w:hAnsi="Consolas"/>
-      <w:color w:val="4E9A06"/>
+      <w:color w:val="20794D"/>
       <w:sz w:val="22"/>
-      <w:shd w:val="clear" w:color="auto" w:fill="F8F8F8"/>
+      <w:shd w:val="clear" w:color="auto" w:fill="F1F3F5"/>
     </w:rPr>
   </w:style>
   <w:style w:type="character" w:customStyle="1" w:styleId="SpecialCharTok">
@@ -2754,10 +2829,9 @@
     <w:basedOn w:val="VerbatimChar"/>
     <w:rPr>
       <w:rFonts w:ascii="Consolas" w:hAnsi="Consolas"/>
-      <w:b/>
-      <w:color w:val="CE5C00"/>
+      <w:color w:val="5E5E5E"/>
       <w:sz w:val="22"/>
-      <w:shd w:val="clear" w:color="auto" w:fill="F8F8F8"/>
+      <w:shd w:val="clear" w:color="auto" w:fill="F1F3F5"/>
     </w:rPr>
   </w:style>
   <w:style w:type="character" w:customStyle="1" w:styleId="StringTok">
@@ -2765,9 +2839,9 @@
     <w:basedOn w:val="VerbatimChar"/>
     <w:rPr>
       <w:rFonts w:ascii="Consolas" w:hAnsi="Consolas"/>
-      <w:color w:val="4E9A06"/>
+      <w:color w:val="20794D"/>
       <w:sz w:val="22"/>
-      <w:shd w:val="clear" w:color="auto" w:fill="F8F8F8"/>
+      <w:shd w:val="clear" w:color="auto" w:fill="F1F3F5"/>
     </w:rPr>
   </w:style>
   <w:style w:type="character" w:customStyle="1" w:styleId="VerbatimStringTok">
@@ -2775,9 +2849,9 @@
     <w:basedOn w:val="VerbatimChar"/>
     <w:rPr>
       <w:rFonts w:ascii="Consolas" w:hAnsi="Consolas"/>
-      <w:color w:val="4E9A06"/>
+      <w:color w:val="20794D"/>
       <w:sz w:val="22"/>
-      <w:shd w:val="clear" w:color="auto" w:fill="F8F8F8"/>
+      <w:shd w:val="clear" w:color="auto" w:fill="F1F3F5"/>
     </w:rPr>
   </w:style>
   <w:style w:type="character" w:customStyle="1" w:styleId="SpecialStringTok">
@@ -2785,9 +2859,9 @@
     <w:basedOn w:val="VerbatimChar"/>
     <w:rPr>
       <w:rFonts w:ascii="Consolas" w:hAnsi="Consolas"/>
-      <w:color w:val="4E9A06"/>
+      <w:color w:val="20794D"/>
       <w:sz w:val="22"/>
-      <w:shd w:val="clear" w:color="auto" w:fill="F8F8F8"/>
+      <w:shd w:val="clear" w:color="auto" w:fill="F1F3F5"/>
     </w:rPr>
   </w:style>
   <w:style w:type="character" w:customStyle="1" w:styleId="ImportTok">
@@ -2795,8 +2869,9 @@
     <w:basedOn w:val="VerbatimChar"/>
     <w:rPr>
       <w:rFonts w:ascii="Consolas" w:hAnsi="Consolas"/>
+      <w:color w:val="00769E"/>
       <w:sz w:val="22"/>
-      <w:shd w:val="clear" w:color="auto" w:fill="F8F8F8"/>
+      <w:shd w:val="clear" w:color="auto" w:fill="F1F3F5"/>
     </w:rPr>
   </w:style>
   <w:style w:type="character" w:customStyle="1" w:styleId="CommentTok">
@@ -2804,10 +2879,9 @@
     <w:basedOn w:val="VerbatimChar"/>
     <w:rPr>
       <w:rFonts w:ascii="Consolas" w:hAnsi="Consolas"/>
-      <w:i/>
-      <w:color w:val="8F5902"/>
+      <w:color w:val="5E5E5E"/>
       <w:sz w:val="22"/>
-      <w:shd w:val="clear" w:color="auto" w:fill="F8F8F8"/>
+      <w:shd w:val="clear" w:color="auto" w:fill="F1F3F5"/>
     </w:rPr>
   </w:style>
   <w:style w:type="character" w:customStyle="1" w:styleId="DocumentationTok">
@@ -2815,11 +2889,10 @@
     <w:basedOn w:val="VerbatimChar"/>
     <w:rPr>
       <w:rFonts w:ascii="Consolas" w:hAnsi="Consolas"/>
-      <w:b/>
       <w:i/>
-      <w:color w:val="8F5902"/>
+      <w:color w:val="5E5E5E"/>
       <w:sz w:val="22"/>
-      <w:shd w:val="clear" w:color="auto" w:fill="F8F8F8"/>
+      <w:shd w:val="clear" w:color="auto" w:fill="F1F3F5"/>
     </w:rPr>
   </w:style>
   <w:style w:type="character" w:customStyle="1" w:styleId="AnnotationTok">
@@ -2827,11 +2900,9 @@
     <w:basedOn w:val="VerbatimChar"/>
     <w:rPr>
       <w:rFonts w:ascii="Consolas" w:hAnsi="Consolas"/>
-      <w:b/>
-      <w:i/>
-      <w:color w:val="8F5902"/>
+      <w:color w:val="5E5E5E"/>
       <w:sz w:val="22"/>
-      <w:shd w:val="clear" w:color="auto" w:fill="F8F8F8"/>
+      <w:shd w:val="clear" w:color="auto" w:fill="F1F3F5"/>
     </w:rPr>
   </w:style>
   <w:style w:type="character" w:customStyle="1" w:styleId="CommentVarTok">
@@ -2839,11 +2910,10 @@
     <w:basedOn w:val="VerbatimChar"/>
     <w:rPr>
       <w:rFonts w:ascii="Consolas" w:hAnsi="Consolas"/>
-      <w:b/>
       <w:i/>
-      <w:color w:val="8F5902"/>
+      <w:color w:val="5E5E5E"/>
       <w:sz w:val="22"/>
-      <w:shd w:val="clear" w:color="auto" w:fill="F8F8F8"/>
+      <w:shd w:val="clear" w:color="auto" w:fill="F1F3F5"/>
     </w:rPr>
   </w:style>
   <w:style w:type="character" w:customStyle="1" w:styleId="OtherTok">
@@ -2851,9 +2921,9 @@
     <w:basedOn w:val="VerbatimChar"/>
     <w:rPr>
       <w:rFonts w:ascii="Consolas" w:hAnsi="Consolas"/>
-      <w:color w:val="8F5902"/>
+      <w:color w:val="003B4F"/>
       <w:sz w:val="22"/>
-      <w:shd w:val="clear" w:color="auto" w:fill="F8F8F8"/>
+      <w:shd w:val="clear" w:color="auto" w:fill="F1F3F5"/>
     </w:rPr>
   </w:style>
   <w:style w:type="character" w:customStyle="1" w:styleId="FunctionTok">
@@ -2861,10 +2931,9 @@
     <w:basedOn w:val="VerbatimChar"/>
     <w:rPr>
       <w:rFonts w:ascii="Consolas" w:hAnsi="Consolas"/>
-      <w:b/>
-      <w:color w:val="204A87"/>
+      <w:color w:val="4758AB"/>
       <w:sz w:val="22"/>
-      <w:shd w:val="clear" w:color="auto" w:fill="F8F8F8"/>
+      <w:shd w:val="clear" w:color="auto" w:fill="F1F3F5"/>
     </w:rPr>
   </w:style>
   <w:style w:type="character" w:customStyle="1" w:styleId="VariableTok">
@@ -2872,9 +2941,9 @@
     <w:basedOn w:val="VerbatimChar"/>
     <w:rPr>
       <w:rFonts w:ascii="Consolas" w:hAnsi="Consolas"/>
-      <w:color w:val="000000"/>
+      <w:color w:val="111111"/>
       <w:sz w:val="22"/>
-      <w:shd w:val="clear" w:color="auto" w:fill="F8F8F8"/>
+      <w:shd w:val="clear" w:color="auto" w:fill="F1F3F5"/>
     </w:rPr>
   </w:style>
   <w:style w:type="character" w:customStyle="1" w:styleId="ControlFlowTok">
@@ -2883,9 +2952,9 @@
     <w:rPr>
       <w:rFonts w:ascii="Consolas" w:hAnsi="Consolas"/>
       <w:b/>
-      <w:color w:val="204A87"/>
+      <w:color w:val="003B4F"/>
       <w:sz w:val="22"/>
-      <w:shd w:val="clear" w:color="auto" w:fill="F8F8F8"/>
+      <w:shd w:val="clear" w:color="auto" w:fill="F1F3F5"/>
     </w:rPr>
   </w:style>
   <w:style w:type="character" w:customStyle="1" w:styleId="OperatorTok">
@@ -2893,10 +2962,9 @@
     <w:basedOn w:val="VerbatimChar"/>
     <w:rPr>
       <w:rFonts w:ascii="Consolas" w:hAnsi="Consolas"/>
-      <w:b/>
-      <w:color w:val="CE5C00"/>
+      <w:color w:val="5E5E5E"/>
       <w:sz w:val="22"/>
-      <w:shd w:val="clear" w:color="auto" w:fill="F8F8F8"/>
+      <w:shd w:val="clear" w:color="auto" w:fill="F1F3F5"/>
     </w:rPr>
   </w:style>
   <w:style w:type="character" w:customStyle="1" w:styleId="BuiltInTok">
@@ -2904,8 +2972,9 @@
     <w:basedOn w:val="VerbatimChar"/>
     <w:rPr>
       <w:rFonts w:ascii="Consolas" w:hAnsi="Consolas"/>
+      <w:color w:val="003B4F"/>
       <w:sz w:val="22"/>
-      <w:shd w:val="clear" w:color="auto" w:fill="F8F8F8"/>
+      <w:shd w:val="clear" w:color="auto" w:fill="F1F3F5"/>
     </w:rPr>
   </w:style>
   <w:style w:type="character" w:customStyle="1" w:styleId="ExtensionTok">
@@ -2913,8 +2982,9 @@
     <w:basedOn w:val="VerbatimChar"/>
     <w:rPr>
       <w:rFonts w:ascii="Consolas" w:hAnsi="Consolas"/>
+      <w:color w:val="003B4F"/>
       <w:sz w:val="22"/>
-      <w:shd w:val="clear" w:color="auto" w:fill="F8F8F8"/>
+      <w:shd w:val="clear" w:color="auto" w:fill="F1F3F5"/>
     </w:rPr>
   </w:style>
   <w:style w:type="character" w:customStyle="1" w:styleId="PreprocessorTok">
@@ -2922,10 +2992,9 @@
     <w:basedOn w:val="VerbatimChar"/>
     <w:rPr>
       <w:rFonts w:ascii="Consolas" w:hAnsi="Consolas"/>
-      <w:i/>
-      <w:color w:val="8F5902"/>
+      <w:color w:val="AD0000"/>
       <w:sz w:val="22"/>
-      <w:shd w:val="clear" w:color="auto" w:fill="F8F8F8"/>
+      <w:shd w:val="clear" w:color="auto" w:fill="F1F3F5"/>
     </w:rPr>
   </w:style>
   <w:style w:type="character" w:customStyle="1" w:styleId="AttributeTok">
@@ -2933,9 +3002,9 @@
     <w:basedOn w:val="VerbatimChar"/>
     <w:rPr>
       <w:rFonts w:ascii="Consolas" w:hAnsi="Consolas"/>
-      <w:color w:val="204A87"/>
+      <w:color w:val="657422"/>
       <w:sz w:val="22"/>
-      <w:shd w:val="clear" w:color="auto" w:fill="F8F8F8"/>
+      <w:shd w:val="clear" w:color="auto" w:fill="F1F3F5"/>
     </w:rPr>
   </w:style>
   <w:style w:type="character" w:customStyle="1" w:styleId="RegionMarkerTok">
@@ -2943,8 +3012,9 @@
     <w:basedOn w:val="VerbatimChar"/>
     <w:rPr>
       <w:rFonts w:ascii="Consolas" w:hAnsi="Consolas"/>
+      <w:color w:val="003B4F"/>
       <w:sz w:val="22"/>
-      <w:shd w:val="clear" w:color="auto" w:fill="F8F8F8"/>
+      <w:shd w:val="clear" w:color="auto" w:fill="F1F3F5"/>
     </w:rPr>
   </w:style>
   <w:style w:type="character" w:customStyle="1" w:styleId="InformationTok">
@@ -2952,11 +3022,9 @@
     <w:basedOn w:val="VerbatimChar"/>
     <w:rPr>
       <w:rFonts w:ascii="Consolas" w:hAnsi="Consolas"/>
-      <w:b/>
-      <w:i/>
-      <w:color w:val="8F5902"/>
+      <w:color w:val="5E5E5E"/>
       <w:sz w:val="22"/>
-      <w:shd w:val="clear" w:color="auto" w:fill="F8F8F8"/>
+      <w:shd w:val="clear" w:color="auto" w:fill="F1F3F5"/>
     </w:rPr>
   </w:style>
   <w:style w:type="character" w:customStyle="1" w:styleId="WarningTok">
@@ -2964,11 +3032,10 @@
     <w:basedOn w:val="VerbatimChar"/>
     <w:rPr>
       <w:rFonts w:ascii="Consolas" w:hAnsi="Consolas"/>
-      <w:b/>
       <w:i/>
-      <w:color w:val="8F5902"/>
+      <w:color w:val="5E5E5E"/>
       <w:sz w:val="22"/>
-      <w:shd w:val="clear" w:color="auto" w:fill="F8F8F8"/>
+      <w:shd w:val="clear" w:color="auto" w:fill="F1F3F5"/>
     </w:rPr>
   </w:style>
   <w:style w:type="character" w:customStyle="1" w:styleId="AlertTok">
@@ -2976,9 +3043,9 @@
     <w:basedOn w:val="VerbatimChar"/>
     <w:rPr>
       <w:rFonts w:ascii="Consolas" w:hAnsi="Consolas"/>
-      <w:color w:val="EF2929"/>
+      <w:color w:val="AD0000"/>
       <w:sz w:val="22"/>
-      <w:shd w:val="clear" w:color="auto" w:fill="F8F8F8"/>
+      <w:shd w:val="clear" w:color="auto" w:fill="F1F3F5"/>
     </w:rPr>
   </w:style>
   <w:style w:type="character" w:customStyle="1" w:styleId="ErrorTok">
@@ -2986,10 +3053,9 @@
     <w:basedOn w:val="VerbatimChar"/>
     <w:rPr>
       <w:rFonts w:ascii="Consolas" w:hAnsi="Consolas"/>
-      <w:b/>
-      <w:color w:val="A40000"/>
+      <w:color w:val="AD0000"/>
       <w:sz w:val="22"/>
-      <w:shd w:val="clear" w:color="auto" w:fill="F8F8F8"/>
+      <w:shd w:val="clear" w:color="auto" w:fill="F1F3F5"/>
     </w:rPr>
   </w:style>
   <w:style w:type="character" w:customStyle="1" w:styleId="NormalTok">
@@ -2997,22 +3063,10 @@
     <w:basedOn w:val="VerbatimChar"/>
     <w:rPr>
       <w:rFonts w:ascii="Consolas" w:hAnsi="Consolas"/>
+      <w:color w:val="003B4F"/>
       <w:sz w:val="22"/>
-      <w:shd w:val="clear" w:color="auto" w:fill="F8F8F8"/>
-    </w:rPr>
-  </w:style>
-  <w:style w:type="paragraph" w:styleId="TOC2">
-    <w:name w:val="toc 2"/>
-    <w:basedOn w:val="Normal"/>
-    <w:next w:val="Normal"/>
-    <w:autoRedefine/>
-    <w:uiPriority w:val="39"/>
-    <w:unhideWhenUsed/>
-    <w:rsid w:val="0069466E"/>
-    <w:pPr>
-      <w:spacing w:after="100"/>
-      <w:ind w:left="240"/>
-    </w:pPr>
+      <w:shd w:val="clear" w:color="auto" w:fill="F1F3F5"/>
+    </w:rPr>
   </w:style>
 </w:styles>
 </file>

</xml_diff>